<commit_message>
feat(uk2): dashboard UK-2, README, perbaikan expected & kebocoran path
- web/uk2.html + uk2.js: dashboard UK-2 (produk + 3 sampel materi): verifikasi,
  matriks skenario, test case (filter), ruang parameter, telaah metode, expected,
  pemetaan hasil, keterlacakan; navigasi UK-2 aktif di semua halaman
- expected: PR-K-02 → AES-256-GCM (Wycheproof), KAT HKDF ← RFC 8448, SHAKE256 batas
- context: path UK-1 relatif (tidak membocorkan path lokal) + test kebocoran
- README bagian UK-2 (peta KUK, cara menjalankan, PERLU_VERIFIKASI, saran UK-3);
  requirements (python-pptx, jsonschema), Makefile (uk2, uk2-samples), CI

Co-Authored-By: Claude Opus 5.5 <noreply@anthropic.com>
</commit_message>
<xml_diff>
--- a/outputs/uk2/UK2_Dokumen_Skenario_Pengujian.docx
+++ b/outputs/uk2/UK2_Dokumen_Skenario_Pengujian.docx
@@ -33,7 +33,7 @@
     </w:p>
     <w:p>
       <w:r>
-        <w:t xml:space="preserve">Dibangkitkan 2026-10-01T10:33:02+07:00 · model 3 tingkat · masukan UK-1: </w:t>
+        <w:t xml:space="preserve">Dibangkitkan 2026-10-01T13:47:12+07:00 · model 3 tingkat · masukan UK-1: </w:t>
       </w:r>
       <w:r>
         <w:rPr>
@@ -132,7 +132,7 @@
         <w:pStyle w:val="ListBullet"/>
       </w:pPr>
       <w:r>
-        <w:t>Expected value: 24 cocok vektor resmi · 381 kriteria · 42 PERLU_VERIFIKASI</w:t>
+        <w:t>Expected value: 25 cocok vektor resmi · 381 kriteria · 39 PERLU_VERIFIKASI</w:t>
       </w:r>
     </w:p>
     <w:p>
@@ -4414,7 +4414,7 @@
         <w:rPr>
           <w:b/>
         </w:rPr>
-        <w:t>149</w:t>
+        <w:t>150</w:t>
       </w:r>
       <w:r>
         <w:t xml:space="preserve"> kombinasi pairwise (100.0% berkurang; semua pasangan tercakup: True).</w:t>
@@ -19075,17 +19075,17 @@
           </w:tcPr>
           <w:p>
             <w:r>
-              <w:t>kat__AES-128-CTR</w:t>
-            </w:r>
-          </w:p>
-        </w:tc>
-        <w:tc>
-          <w:tcPr>
-            <w:tcW w:type="dxa" w:w="1440"/>
-          </w:tcPr>
-          <w:p>
-            <w:r>
-              <w:t>AES-128-CTR</w:t>
+              <w:t>hash_boundaries__SHAKE256</w:t>
+            </w:r>
+          </w:p>
+        </w:tc>
+        <w:tc>
+          <w:tcPr>
+            <w:tcW w:type="dxa" w:w="1440"/>
+          </w:tcPr>
+          <w:p>
+            <w:r>
+              <w:t>SHAKE256</w:t>
             </w:r>
           </w:p>
         </w:tc>
@@ -19115,17 +19115,17 @@
           </w:tcPr>
           <w:p>
             <w:r>
-              <w:t>7/7</w:t>
-            </w:r>
-          </w:p>
-        </w:tc>
-        <w:tc>
-          <w:tcPr>
-            <w:tcW w:type="dxa" w:w="1440"/>
-          </w:tcPr>
-          <w:p>
-            <w:r>
-              <w:t>3d743d956ce882c6…</w:t>
+              <w:t>13/13</w:t>
+            </w:r>
+          </w:p>
+        </w:tc>
+        <w:tc>
+          <w:tcPr>
+            <w:tcW w:type="dxa" w:w="1440"/>
+          </w:tcPr>
+          <w:p>
+            <w:r>
+              <w:t>d372a99363a793a2…</w:t>
             </w:r>
           </w:p>
         </w:tc>
@@ -19137,17 +19137,17 @@
           </w:tcPr>
           <w:p>
             <w:r>
-              <w:t>kat__AES-256-GCM</w:t>
-            </w:r>
-          </w:p>
-        </w:tc>
-        <w:tc>
-          <w:tcPr>
-            <w:tcW w:type="dxa" w:w="1440"/>
-          </w:tcPr>
-          <w:p>
-            <w:r>
-              <w:t>AES-256-GCM</w:t>
+              <w:t>kat__AES-128-CTR</w:t>
+            </w:r>
+          </w:p>
+        </w:tc>
+        <w:tc>
+          <w:tcPr>
+            <w:tcW w:type="dxa" w:w="1440"/>
+          </w:tcPr>
+          <w:p>
+            <w:r>
+              <w:t>AES-128-CTR</w:t>
             </w:r>
           </w:p>
         </w:tc>
@@ -19177,17 +19177,17 @@
           </w:tcPr>
           <w:p>
             <w:r>
-              <w:t>66/66</w:t>
-            </w:r>
-          </w:p>
-        </w:tc>
-        <w:tc>
-          <w:tcPr>
-            <w:tcW w:type="dxa" w:w="1440"/>
-          </w:tcPr>
-          <w:p>
-            <w:r>
-              <w:t>0f59a33f04b0a9e0…</w:t>
+              <w:t>7/7</w:t>
+            </w:r>
+          </w:p>
+        </w:tc>
+        <w:tc>
+          <w:tcPr>
+            <w:tcW w:type="dxa" w:w="1440"/>
+          </w:tcPr>
+          <w:p>
+            <w:r>
+              <w:t>3d743d956ce882c6…</w:t>
             </w:r>
           </w:p>
         </w:tc>
@@ -19199,17 +19199,17 @@
           </w:tcPr>
           <w:p>
             <w:r>
-              <w:t>kat__AES-256-KW</w:t>
-            </w:r>
-          </w:p>
-        </w:tc>
-        <w:tc>
-          <w:tcPr>
-            <w:tcW w:type="dxa" w:w="1440"/>
-          </w:tcPr>
-          <w:p>
-            <w:r>
-              <w:t>AES-256-KW</w:t>
+              <w:t>kat__AES-256-GCM</w:t>
+            </w:r>
+          </w:p>
+        </w:tc>
+        <w:tc>
+          <w:tcPr>
+            <w:tcW w:type="dxa" w:w="1440"/>
+          </w:tcPr>
+          <w:p>
+            <w:r>
+              <w:t>AES-256-GCM</w:t>
             </w:r>
           </w:p>
         </w:tc>
@@ -19239,17 +19239,17 @@
           </w:tcPr>
           <w:p>
             <w:r>
-              <w:t>68/68</w:t>
-            </w:r>
-          </w:p>
-        </w:tc>
-        <w:tc>
-          <w:tcPr>
-            <w:tcW w:type="dxa" w:w="1440"/>
-          </w:tcPr>
-          <w:p>
-            <w:r>
-              <w:t>48a4be6bfba21e8d…</w:t>
+              <w:t>66/66</w:t>
+            </w:r>
+          </w:p>
+        </w:tc>
+        <w:tc>
+          <w:tcPr>
+            <w:tcW w:type="dxa" w:w="1440"/>
+          </w:tcPr>
+          <w:p>
+            <w:r>
+              <w:t>0f59a33f04b0a9e0…</w:t>
             </w:r>
           </w:p>
         </w:tc>
@@ -19261,17 +19261,17 @@
           </w:tcPr>
           <w:p>
             <w:r>
-              <w:t>kat__CHACHA20-256</w:t>
-            </w:r>
-          </w:p>
-        </w:tc>
-        <w:tc>
-          <w:tcPr>
-            <w:tcW w:type="dxa" w:w="1440"/>
-          </w:tcPr>
-          <w:p>
-            <w:r>
-              <w:t>CHACHA20-256</w:t>
+              <w:t>kat__AES-256-KW</w:t>
+            </w:r>
+          </w:p>
+        </w:tc>
+        <w:tc>
+          <w:tcPr>
+            <w:tcW w:type="dxa" w:w="1440"/>
+          </w:tcPr>
+          <w:p>
+            <w:r>
+              <w:t>AES-256-KW</w:t>
             </w:r>
           </w:p>
         </w:tc>
@@ -19301,17 +19301,17 @@
           </w:tcPr>
           <w:p>
             <w:r>
-              <w:t>3/3</w:t>
-            </w:r>
-          </w:p>
-        </w:tc>
-        <w:tc>
-          <w:tcPr>
-            <w:tcW w:type="dxa" w:w="1440"/>
-          </w:tcPr>
-          <w:p>
-            <w:r>
-              <w:t>809f2c2c9c9bd28f…</w:t>
+              <w:t>68/68</w:t>
+            </w:r>
+          </w:p>
+        </w:tc>
+        <w:tc>
+          <w:tcPr>
+            <w:tcW w:type="dxa" w:w="1440"/>
+          </w:tcPr>
+          <w:p>
+            <w:r>
+              <w:t>48a4be6bfba21e8d…</w:t>
             </w:r>
           </w:p>
         </w:tc>
@@ -19323,17 +19323,17 @@
           </w:tcPr>
           <w:p>
             <w:r>
-              <w:t>kat__CHACHA20-POLY1305</w:t>
-            </w:r>
-          </w:p>
-        </w:tc>
-        <w:tc>
-          <w:tcPr>
-            <w:tcW w:type="dxa" w:w="1440"/>
-          </w:tcPr>
-          <w:p>
-            <w:r>
-              <w:t>CHACHA20-POLY1305</w:t>
+              <w:t>kat__CHACHA20-256</w:t>
+            </w:r>
+          </w:p>
+        </w:tc>
+        <w:tc>
+          <w:tcPr>
+            <w:tcW w:type="dxa" w:w="1440"/>
+          </w:tcPr>
+          <w:p>
+            <w:r>
+              <w:t>CHACHA20-256</w:t>
             </w:r>
           </w:p>
         </w:tc>
@@ -19363,17 +19363,17 @@
           </w:tcPr>
           <w:p>
             <w:r>
-              <w:t>316/316</w:t>
-            </w:r>
-          </w:p>
-        </w:tc>
-        <w:tc>
-          <w:tcPr>
-            <w:tcW w:type="dxa" w:w="1440"/>
-          </w:tcPr>
-          <w:p>
-            <w:r>
-              <w:t>b40874a805fcc063…</w:t>
+              <w:t>3/3</w:t>
+            </w:r>
+          </w:p>
+        </w:tc>
+        <w:tc>
+          <w:tcPr>
+            <w:tcW w:type="dxa" w:w="1440"/>
+          </w:tcPr>
+          <w:p>
+            <w:r>
+              <w:t>809f2c2c9c9bd28f…</w:t>
             </w:r>
           </w:p>
         </w:tc>
@@ -19385,17 +19385,17 @@
           </w:tcPr>
           <w:p>
             <w:r>
-              <w:t>kat__CMAC-AES-128</w:t>
-            </w:r>
-          </w:p>
-        </w:tc>
-        <w:tc>
-          <w:tcPr>
-            <w:tcW w:type="dxa" w:w="1440"/>
-          </w:tcPr>
-          <w:p>
-            <w:r>
-              <w:t>CMAC-AES-128</w:t>
+              <w:t>kat__CHACHA20-POLY1305</w:t>
+            </w:r>
+          </w:p>
+        </w:tc>
+        <w:tc>
+          <w:tcPr>
+            <w:tcW w:type="dxa" w:w="1440"/>
+          </w:tcPr>
+          <w:p>
+            <w:r>
+              <w:t>CHACHA20-POLY1305</w:t>
             </w:r>
           </w:p>
         </w:tc>
@@ -19425,17 +19425,17 @@
           </w:tcPr>
           <w:p>
             <w:r>
-              <w:t>102/102</w:t>
-            </w:r>
-          </w:p>
-        </w:tc>
-        <w:tc>
-          <w:tcPr>
-            <w:tcW w:type="dxa" w:w="1440"/>
-          </w:tcPr>
-          <w:p>
-            <w:r>
-              <w:t>58712a70a704e00f…</w:t>
+              <w:t>316/316</w:t>
+            </w:r>
+          </w:p>
+        </w:tc>
+        <w:tc>
+          <w:tcPr>
+            <w:tcW w:type="dxa" w:w="1440"/>
+          </w:tcPr>
+          <w:p>
+            <w:r>
+              <w:t>b40874a805fcc063…</w:t>
             </w:r>
           </w:p>
         </w:tc>
@@ -19447,17 +19447,17 @@
           </w:tcPr>
           <w:p>
             <w:r>
-              <w:t>kat__ECDH-P384</w:t>
-            </w:r>
-          </w:p>
-        </w:tc>
-        <w:tc>
-          <w:tcPr>
-            <w:tcW w:type="dxa" w:w="1440"/>
-          </w:tcPr>
-          <w:p>
-            <w:r>
-              <w:t>ECDH-P384</w:t>
+              <w:t>kat__CMAC-AES-128</w:t>
+            </w:r>
+          </w:p>
+        </w:tc>
+        <w:tc>
+          <w:tcPr>
+            <w:tcW w:type="dxa" w:w="1440"/>
+          </w:tcPr>
+          <w:p>
+            <w:r>
+              <w:t>CMAC-AES-128</w:t>
             </w:r>
           </w:p>
         </w:tc>
@@ -19487,17 +19487,17 @@
           </w:tcPr>
           <w:p>
             <w:r>
-              <w:t>1047/1047</w:t>
-            </w:r>
-          </w:p>
-        </w:tc>
-        <w:tc>
-          <w:tcPr>
-            <w:tcW w:type="dxa" w:w="1440"/>
-          </w:tcPr>
-          <w:p>
-            <w:r>
-              <w:t>3bfdb1e13c460060…</w:t>
+              <w:t>102/102</w:t>
+            </w:r>
+          </w:p>
+        </w:tc>
+        <w:tc>
+          <w:tcPr>
+            <w:tcW w:type="dxa" w:w="1440"/>
+          </w:tcPr>
+          <w:p>
+            <w:r>
+              <w:t>58712a70a704e00f…</w:t>
             </w:r>
           </w:p>
         </w:tc>
@@ -19509,17 +19509,17 @@
           </w:tcPr>
           <w:p>
             <w:r>
-              <w:t>kat__ED25519</w:t>
-            </w:r>
-          </w:p>
-        </w:tc>
-        <w:tc>
-          <w:tcPr>
-            <w:tcW w:type="dxa" w:w="1440"/>
-          </w:tcPr>
-          <w:p>
-            <w:r>
-              <w:t>ED25519</w:t>
+              <w:t>kat__ECDH-P384</w:t>
+            </w:r>
+          </w:p>
+        </w:tc>
+        <w:tc>
+          <w:tcPr>
+            <w:tcW w:type="dxa" w:w="1440"/>
+          </w:tcPr>
+          <w:p>
+            <w:r>
+              <w:t>ECDH-P384</w:t>
             </w:r>
           </w:p>
         </w:tc>
@@ -19549,17 +19549,17 @@
           </w:tcPr>
           <w:p>
             <w:r>
-              <w:t>151/151</w:t>
-            </w:r>
-          </w:p>
-        </w:tc>
-        <w:tc>
-          <w:tcPr>
-            <w:tcW w:type="dxa" w:w="1440"/>
-          </w:tcPr>
-          <w:p>
-            <w:r>
-              <w:t>fc38470cf283c6f9…</w:t>
+              <w:t>1047/1047</w:t>
+            </w:r>
+          </w:p>
+        </w:tc>
+        <w:tc>
+          <w:tcPr>
+            <w:tcW w:type="dxa" w:w="1440"/>
+          </w:tcPr>
+          <w:p>
+            <w:r>
+              <w:t>3bfdb1e13c460060…</w:t>
             </w:r>
           </w:p>
         </w:tc>
@@ -19571,17 +19571,17 @@
           </w:tcPr>
           <w:p>
             <w:r>
-              <w:t>kat__HMAC-SHA-256-K128</w:t>
-            </w:r>
-          </w:p>
-        </w:tc>
-        <w:tc>
-          <w:tcPr>
-            <w:tcW w:type="dxa" w:w="1440"/>
-          </w:tcPr>
-          <w:p>
-            <w:r>
-              <w:t>HMAC-SHA-256-K128</w:t>
+              <w:t>kat__ED25519</w:t>
+            </w:r>
+          </w:p>
+        </w:tc>
+        <w:tc>
+          <w:tcPr>
+            <w:tcW w:type="dxa" w:w="1440"/>
+          </w:tcPr>
+          <w:p>
+            <w:r>
+              <w:t>ED25519</w:t>
             </w:r>
           </w:p>
         </w:tc>
@@ -19611,17 +19611,17 @@
           </w:tcPr>
           <w:p>
             <w:r>
-              <w:t>3/3</w:t>
-            </w:r>
-          </w:p>
-        </w:tc>
-        <w:tc>
-          <w:tcPr>
-            <w:tcW w:type="dxa" w:w="1440"/>
-          </w:tcPr>
-          <w:p>
-            <w:r>
-              <w:t>4b866969d8950ef3…</w:t>
+              <w:t>151/151</w:t>
+            </w:r>
+          </w:p>
+        </w:tc>
+        <w:tc>
+          <w:tcPr>
+            <w:tcW w:type="dxa" w:w="1440"/>
+          </w:tcPr>
+          <w:p>
+            <w:r>
+              <w:t>fc38470cf283c6f9…</w:t>
             </w:r>
           </w:p>
         </w:tc>
@@ -19633,17 +19633,17 @@
           </w:tcPr>
           <w:p>
             <w:r>
-              <w:t>kat__HMAC-SHA-256-K256</w:t>
-            </w:r>
-          </w:p>
-        </w:tc>
-        <w:tc>
-          <w:tcPr>
-            <w:tcW w:type="dxa" w:w="1440"/>
-          </w:tcPr>
-          <w:p>
-            <w:r>
-              <w:t>HMAC-SHA-256-K256</w:t>
+              <w:t>kat__HMAC-SHA-256-K128</w:t>
+            </w:r>
+          </w:p>
+        </w:tc>
+        <w:tc>
+          <w:tcPr>
+            <w:tcW w:type="dxa" w:w="1440"/>
+          </w:tcPr>
+          <w:p>
+            <w:r>
+              <w:t>HMAC-SHA-256-K128</w:t>
             </w:r>
           </w:p>
         </w:tc>
@@ -19673,17 +19673,17 @@
           </w:tcPr>
           <w:p>
             <w:r>
-              <w:t>81/81</w:t>
-            </w:r>
-          </w:p>
-        </w:tc>
-        <w:tc>
-          <w:tcPr>
-            <w:tcW w:type="dxa" w:w="1440"/>
-          </w:tcPr>
-          <w:p>
-            <w:r>
-              <w:t>1d47b843c727cea5…</w:t>
+              <w:t>3/3</w:t>
+            </w:r>
+          </w:p>
+        </w:tc>
+        <w:tc>
+          <w:tcPr>
+            <w:tcW w:type="dxa" w:w="1440"/>
+          </w:tcPr>
+          <w:p>
+            <w:r>
+              <w:t>4b866969d8950ef3…</w:t>
             </w:r>
           </w:p>
         </w:tc>
@@ -19695,17 +19695,17 @@
           </w:tcPr>
           <w:p>
             <w:r>
-              <w:t>kat__RSA-OAEP-2048</w:t>
-            </w:r>
-          </w:p>
-        </w:tc>
-        <w:tc>
-          <w:tcPr>
-            <w:tcW w:type="dxa" w:w="1440"/>
-          </w:tcPr>
-          <w:p>
-            <w:r>
-              <w:t>RSA-OAEP-2048</w:t>
+              <w:t>kat__HMAC-SHA-256-K256</w:t>
+            </w:r>
+          </w:p>
+        </w:tc>
+        <w:tc>
+          <w:tcPr>
+            <w:tcW w:type="dxa" w:w="1440"/>
+          </w:tcPr>
+          <w:p>
+            <w:r>
+              <w:t>HMAC-SHA-256-K256</w:t>
             </w:r>
           </w:p>
         </w:tc>
@@ -19735,17 +19735,17 @@
           </w:tcPr>
           <w:p>
             <w:r>
-              <w:t>49/49</w:t>
-            </w:r>
-          </w:p>
-        </w:tc>
-        <w:tc>
-          <w:tcPr>
-            <w:tcW w:type="dxa" w:w="1440"/>
-          </w:tcPr>
-          <w:p>
-            <w:r>
-              <w:t>98f6fb1b1a73af13…</w:t>
+              <w:t>81/81</w:t>
+            </w:r>
+          </w:p>
+        </w:tc>
+        <w:tc>
+          <w:tcPr>
+            <w:tcW w:type="dxa" w:w="1440"/>
+          </w:tcPr>
+          <w:p>
+            <w:r>
+              <w:t>1d47b843c727cea5…</w:t>
             </w:r>
           </w:p>
         </w:tc>
@@ -19757,17 +19757,17 @@
           </w:tcPr>
           <w:p>
             <w:r>
-              <w:t>kat__RSA-OAEP-3072</w:t>
-            </w:r>
-          </w:p>
-        </w:tc>
-        <w:tc>
-          <w:tcPr>
-            <w:tcW w:type="dxa" w:w="1440"/>
-          </w:tcPr>
-          <w:p>
-            <w:r>
-              <w:t>RSA-OAEP-3072</w:t>
+              <w:t>kat__RSA-OAEP-2048</w:t>
+            </w:r>
+          </w:p>
+        </w:tc>
+        <w:tc>
+          <w:tcPr>
+            <w:tcW w:type="dxa" w:w="1440"/>
+          </w:tcPr>
+          <w:p>
+            <w:r>
+              <w:t>RSA-OAEP-2048</w:t>
             </w:r>
           </w:p>
         </w:tc>
@@ -19797,17 +19797,17 @@
           </w:tcPr>
           <w:p>
             <w:r>
-              <w:t>37/37</w:t>
-            </w:r>
-          </w:p>
-        </w:tc>
-        <w:tc>
-          <w:tcPr>
-            <w:tcW w:type="dxa" w:w="1440"/>
-          </w:tcPr>
-          <w:p>
-            <w:r>
-              <w:t>7265d044276aead3…</w:t>
+              <w:t>49/49</w:t>
+            </w:r>
+          </w:p>
+        </w:tc>
+        <w:tc>
+          <w:tcPr>
+            <w:tcW w:type="dxa" w:w="1440"/>
+          </w:tcPr>
+          <w:p>
+            <w:r>
+              <w:t>98f6fb1b1a73af13…</w:t>
             </w:r>
           </w:p>
         </w:tc>
@@ -19819,17 +19819,17 @@
           </w:tcPr>
           <w:p>
             <w:r>
-              <w:t>kat__X25519</w:t>
-            </w:r>
-          </w:p>
-        </w:tc>
-        <w:tc>
-          <w:tcPr>
-            <w:tcW w:type="dxa" w:w="1440"/>
-          </w:tcPr>
-          <w:p>
-            <w:r>
-              <w:t>X25519</w:t>
+              <w:t>kat__RSA-OAEP-3072</w:t>
+            </w:r>
+          </w:p>
+        </w:tc>
+        <w:tc>
+          <w:tcPr>
+            <w:tcW w:type="dxa" w:w="1440"/>
+          </w:tcPr>
+          <w:p>
+            <w:r>
+              <w:t>RSA-OAEP-3072</w:t>
             </w:r>
           </w:p>
         </w:tc>
@@ -19859,17 +19859,17 @@
           </w:tcPr>
           <w:p>
             <w:r>
-              <w:t>518/518</w:t>
-            </w:r>
-          </w:p>
-        </w:tc>
-        <w:tc>
-          <w:tcPr>
-            <w:tcW w:type="dxa" w:w="1440"/>
-          </w:tcPr>
-          <w:p>
-            <w:r>
-              <w:t>b2e8dc378d852a7d…</w:t>
+              <w:t>37/37</w:t>
+            </w:r>
+          </w:p>
+        </w:tc>
+        <w:tc>
+          <w:tcPr>
+            <w:tcW w:type="dxa" w:w="1440"/>
+          </w:tcPr>
+          <w:p>
+            <w:r>
+              <w:t>7265d044276aead3…</w:t>
             </w:r>
           </w:p>
         </w:tc>
@@ -19881,17 +19881,17 @@
           </w:tcPr>
           <w:p>
             <w:r>
-              <w:t>rfc6979__ECDSA-P256</w:t>
-            </w:r>
-          </w:p>
-        </w:tc>
-        <w:tc>
-          <w:tcPr>
-            <w:tcW w:type="dxa" w:w="1440"/>
-          </w:tcPr>
-          <w:p>
-            <w:r>
-              <w:t>ECDSA-P256</w:t>
+              <w:t>kat__X25519</w:t>
+            </w:r>
+          </w:p>
+        </w:tc>
+        <w:tc>
+          <w:tcPr>
+            <w:tcW w:type="dxa" w:w="1440"/>
+          </w:tcPr>
+          <w:p>
+            <w:r>
+              <w:t>X25519</w:t>
             </w:r>
           </w:p>
         </w:tc>
@@ -19921,17 +19921,17 @@
           </w:tcPr>
           <w:p>
             <w:r>
-              <w:t>4/4</w:t>
-            </w:r>
-          </w:p>
-        </w:tc>
-        <w:tc>
-          <w:tcPr>
-            <w:tcW w:type="dxa" w:w="1440"/>
-          </w:tcPr>
-          <w:p>
-            <w:r>
-              <w:t>1b343225ff5109f2…</w:t>
+              <w:t>518/518</w:t>
+            </w:r>
+          </w:p>
+        </w:tc>
+        <w:tc>
+          <w:tcPr>
+            <w:tcW w:type="dxa" w:w="1440"/>
+          </w:tcPr>
+          <w:p>
+            <w:r>
+              <w:t>b2e8dc378d852a7d…</w:t>
             </w:r>
           </w:p>
         </w:tc>
@@ -19943,17 +19943,17 @@
           </w:tcPr>
           <w:p>
             <w:r>
-              <w:t>rfc6979__ECDSA-P384</w:t>
-            </w:r>
-          </w:p>
-        </w:tc>
-        <w:tc>
-          <w:tcPr>
-            <w:tcW w:type="dxa" w:w="1440"/>
-          </w:tcPr>
-          <w:p>
-            <w:r>
-              <w:t>ECDSA-P384</w:t>
+              <w:t>rfc6979__ECDSA-P256</w:t>
+            </w:r>
+          </w:p>
+        </w:tc>
+        <w:tc>
+          <w:tcPr>
+            <w:tcW w:type="dxa" w:w="1440"/>
+          </w:tcPr>
+          <w:p>
+            <w:r>
+              <w:t>ECDSA-P256</w:t>
             </w:r>
           </w:p>
         </w:tc>
@@ -19993,7 +19993,7 @@
           </w:tcPr>
           <w:p>
             <w:r>
-              <w:t>7fdb67c736ef8c90…</w:t>
+              <w:t>1b343225ff5109f2…</w:t>
             </w:r>
           </w:p>
         </w:tc>
@@ -20005,17 +20005,17 @@
           </w:tcPr>
           <w:p>
             <w:r>
-              <w:t>sigver__ECDSA-P256</w:t>
-            </w:r>
-          </w:p>
-        </w:tc>
-        <w:tc>
-          <w:tcPr>
-            <w:tcW w:type="dxa" w:w="1440"/>
-          </w:tcPr>
-          <w:p>
-            <w:r>
-              <w:t>ECDSA-P256</w:t>
+              <w:t>rfc6979__ECDSA-P384</w:t>
+            </w:r>
+          </w:p>
+        </w:tc>
+        <w:tc>
+          <w:tcPr>
+            <w:tcW w:type="dxa" w:w="1440"/>
+          </w:tcPr>
+          <w:p>
+            <w:r>
+              <w:t>ECDSA-P384</w:t>
             </w:r>
           </w:p>
         </w:tc>
@@ -20045,17 +20045,17 @@
           </w:tcPr>
           <w:p>
             <w:r>
-              <w:t>516/516</w:t>
-            </w:r>
-          </w:p>
-        </w:tc>
-        <w:tc>
-          <w:tcPr>
-            <w:tcW w:type="dxa" w:w="1440"/>
-          </w:tcPr>
-          <w:p>
-            <w:r>
-              <w:t>c331a7418794f46d…</w:t>
+              <w:t>4/4</w:t>
+            </w:r>
+          </w:p>
+        </w:tc>
+        <w:tc>
+          <w:tcPr>
+            <w:tcW w:type="dxa" w:w="1440"/>
+          </w:tcPr>
+          <w:p>
+            <w:r>
+              <w:t>7fdb67c736ef8c90…</w:t>
             </w:r>
           </w:p>
         </w:tc>
@@ -20067,17 +20067,17 @@
           </w:tcPr>
           <w:p>
             <w:r>
-              <w:t>curve_points__ECDSA-P384</w:t>
-            </w:r>
-          </w:p>
-        </w:tc>
-        <w:tc>
-          <w:tcPr>
-            <w:tcW w:type="dxa" w:w="1440"/>
-          </w:tcPr>
-          <w:p>
-            <w:r>
-              <w:t>ECDSA-P384</w:t>
+              <w:t>sigver__ECDSA-P256</w:t>
+            </w:r>
+          </w:p>
+        </w:tc>
+        <w:tc>
+          <w:tcPr>
+            <w:tcW w:type="dxa" w:w="1440"/>
+          </w:tcPr>
+          <w:p>
+            <w:r>
+              <w:t>ECDSA-P256</w:t>
             </w:r>
           </w:p>
         </w:tc>
@@ -20097,27 +20097,27 @@
           </w:tcPr>
           <w:p>
             <w:r>
-              <w:t>PERLU_VERIFIKASI</w:t>
-            </w:r>
-          </w:p>
-        </w:tc>
-        <w:tc>
-          <w:tcPr>
-            <w:tcW w:type="dxa" w:w="1440"/>
-          </w:tcPr>
-          <w:p>
-            <w:r>
-              <w:t>—</w:t>
-            </w:r>
-          </w:p>
-        </w:tc>
-        <w:tc>
-          <w:tcPr>
-            <w:tcW w:type="dxa" w:w="1440"/>
-          </w:tcPr>
-          <w:p>
-            <w:r>
-              <w:t>83c50eef835c9c1c…</w:t>
+              <w:t>COCOK_VEKTOR_RESMI</w:t>
+            </w:r>
+          </w:p>
+        </w:tc>
+        <w:tc>
+          <w:tcPr>
+            <w:tcW w:type="dxa" w:w="1440"/>
+          </w:tcPr>
+          <w:p>
+            <w:r>
+              <w:t>516/516</w:t>
+            </w:r>
+          </w:p>
+        </w:tc>
+        <w:tc>
+          <w:tcPr>
+            <w:tcW w:type="dxa" w:w="1440"/>
+          </w:tcPr>
+          <w:p>
+            <w:r>
+              <w:t>c331a7418794f46d…</w:t>
             </w:r>
           </w:p>
         </w:tc>
@@ -20129,7 +20129,7 @@
           </w:tcPr>
           <w:p>
             <w:r>
-              <w:t>domain_params__ECDSA-P384</w:t>
+              <w:t>curve_points__ECDSA-P384</w:t>
             </w:r>
           </w:p>
         </w:tc>
@@ -20179,7 +20179,7 @@
           </w:tcPr>
           <w:p>
             <w:r>
-              <w:t>f375ffa0b05ed27c…</w:t>
+              <w:t>83c50eef835c9c1c…</w:t>
             </w:r>
           </w:p>
         </w:tc>
@@ -20191,17 +20191,17 @@
           </w:tcPr>
           <w:p>
             <w:r>
-              <w:t>hash_boundaries__HMAC-SHA-256-K128</w:t>
-            </w:r>
-          </w:p>
-        </w:tc>
-        <w:tc>
-          <w:tcPr>
-            <w:tcW w:type="dxa" w:w="1440"/>
-          </w:tcPr>
-          <w:p>
-            <w:r>
-              <w:t>HMAC-SHA-256-K128</w:t>
+              <w:t>domain_params__ECDSA-P384</w:t>
+            </w:r>
+          </w:p>
+        </w:tc>
+        <w:tc>
+          <w:tcPr>
+            <w:tcW w:type="dxa" w:w="1440"/>
+          </w:tcPr>
+          <w:p>
+            <w:r>
+              <w:t>ECDSA-P384</w:t>
             </w:r>
           </w:p>
         </w:tc>
@@ -20241,7 +20241,7 @@
           </w:tcPr>
           <w:p>
             <w:r>
-              <w:t>77424b9be0393918…</w:t>
+              <w:t>f375ffa0b05ed27c…</w:t>
             </w:r>
           </w:p>
         </w:tc>
@@ -20253,17 +20253,17 @@
           </w:tcPr>
           <w:p>
             <w:r>
-              <w:t>hash_boundaries__HMAC-SHA-256-K256</w:t>
-            </w:r>
-          </w:p>
-        </w:tc>
-        <w:tc>
-          <w:tcPr>
-            <w:tcW w:type="dxa" w:w="1440"/>
-          </w:tcPr>
-          <w:p>
-            <w:r>
-              <w:t>HMAC-SHA-256-K256</w:t>
+              <w:t>interop__AES-128-CTR</w:t>
+            </w:r>
+          </w:p>
+        </w:tc>
+        <w:tc>
+          <w:tcPr>
+            <w:tcW w:type="dxa" w:w="1440"/>
+          </w:tcPr>
+          <w:p>
+            <w:r>
+              <w:t>AES-128-CTR</w:t>
             </w:r>
           </w:p>
         </w:tc>
@@ -20283,7 +20283,7 @@
           </w:tcPr>
           <w:p>
             <w:r>
-              <w:t>PERLU_VERIFIKASI</w:t>
+              <w:t>KRITERIA</w:t>
             </w:r>
           </w:p>
         </w:tc>
@@ -20303,7 +20303,7 @@
           </w:tcPr>
           <w:p>
             <w:r>
-              <w:t>be267e85951033bc…</w:t>
+              <w:t>8bbe9a1dd1ab8bcd…</w:t>
             </w:r>
           </w:p>
         </w:tc>
@@ -20315,17 +20315,17 @@
           </w:tcPr>
           <w:p>
             <w:r>
-              <w:t>hash_boundaries__SHAKE256</w:t>
-            </w:r>
-          </w:p>
-        </w:tc>
-        <w:tc>
-          <w:tcPr>
-            <w:tcW w:type="dxa" w:w="1440"/>
-          </w:tcPr>
-          <w:p>
-            <w:r>
-              <w:t>SHAKE256</w:t>
+              <w:t>interop__AES-256-GCM</w:t>
+            </w:r>
+          </w:p>
+        </w:tc>
+        <w:tc>
+          <w:tcPr>
+            <w:tcW w:type="dxa" w:w="1440"/>
+          </w:tcPr>
+          <w:p>
+            <w:r>
+              <w:t>AES-256-GCM</w:t>
             </w:r>
           </w:p>
         </w:tc>
@@ -20345,7 +20345,7 @@
           </w:tcPr>
           <w:p>
             <w:r>
-              <w:t>PERLU_VERIFIKASI</w:t>
+              <w:t>KRITERIA</w:t>
             </w:r>
           </w:p>
         </w:tc>
@@ -20365,7 +20365,7 @@
           </w:tcPr>
           <w:p>
             <w:r>
-              <w:t>90fcad44690491bb…</w:t>
+              <w:t>c3fd2e9032182df7…</w:t>
             </w:r>
           </w:p>
         </w:tc>
@@ -20377,17 +20377,17 @@
           </w:tcPr>
           <w:p>
             <w:r>
-              <w:t>interop__AES-128-CTR</w:t>
-            </w:r>
-          </w:p>
-        </w:tc>
-        <w:tc>
-          <w:tcPr>
-            <w:tcW w:type="dxa" w:w="1440"/>
-          </w:tcPr>
-          <w:p>
-            <w:r>
-              <w:t>AES-128-CTR</w:t>
+              <w:t>interop__AES-256-KW</w:t>
+            </w:r>
+          </w:p>
+        </w:tc>
+        <w:tc>
+          <w:tcPr>
+            <w:tcW w:type="dxa" w:w="1440"/>
+          </w:tcPr>
+          <w:p>
+            <w:r>
+              <w:t>AES-256-KW</w:t>
             </w:r>
           </w:p>
         </w:tc>
@@ -20427,7 +20427,7 @@
           </w:tcPr>
           <w:p>
             <w:r>
-              <w:t>8bbe9a1dd1ab8bcd…</w:t>
+              <w:t>6eff993a6c53e742…</w:t>
             </w:r>
           </w:p>
         </w:tc>
@@ -20439,17 +20439,17 @@
           </w:tcPr>
           <w:p>
             <w:r>
-              <w:t>interop__AES-256-GCM</w:t>
-            </w:r>
-          </w:p>
-        </w:tc>
-        <w:tc>
-          <w:tcPr>
-            <w:tcW w:type="dxa" w:w="1440"/>
-          </w:tcPr>
-          <w:p>
-            <w:r>
-              <w:t>AES-256-GCM</w:t>
+              <w:t>interop__ASCON-AEAD128</w:t>
+            </w:r>
+          </w:p>
+        </w:tc>
+        <w:tc>
+          <w:tcPr>
+            <w:tcW w:type="dxa" w:w="1440"/>
+          </w:tcPr>
+          <w:p>
+            <w:r>
+              <w:t>ASCON-AEAD128</w:t>
             </w:r>
           </w:p>
         </w:tc>
@@ -20489,7 +20489,7 @@
           </w:tcPr>
           <w:p>
             <w:r>
-              <w:t>c3fd2e9032182df7…</w:t>
+              <w:t>1fb82808f12f36ac…</w:t>
             </w:r>
           </w:p>
         </w:tc>
@@ -20501,17 +20501,17 @@
           </w:tcPr>
           <w:p>
             <w:r>
-              <w:t>interop__AES-256-KW</w:t>
-            </w:r>
-          </w:p>
-        </w:tc>
-        <w:tc>
-          <w:tcPr>
-            <w:tcW w:type="dxa" w:w="1440"/>
-          </w:tcPr>
-          <w:p>
-            <w:r>
-              <w:t>AES-256-KW</w:t>
+              <w:t>interop__BLAKE2B-512</w:t>
+            </w:r>
+          </w:p>
+        </w:tc>
+        <w:tc>
+          <w:tcPr>
+            <w:tcW w:type="dxa" w:w="1440"/>
+          </w:tcPr>
+          <w:p>
+            <w:r>
+              <w:t>BLAKE2B-512</w:t>
             </w:r>
           </w:p>
         </w:tc>
@@ -20551,7 +20551,7 @@
           </w:tcPr>
           <w:p>
             <w:r>
-              <w:t>6eff993a6c53e742…</w:t>
+              <w:t>b63c4650023015f8…</w:t>
             </w:r>
           </w:p>
         </w:tc>
@@ -20563,17 +20563,17 @@
           </w:tcPr>
           <w:p>
             <w:r>
-              <w:t>interop__ASCON-AEAD128</w:t>
-            </w:r>
-          </w:p>
-        </w:tc>
-        <w:tc>
-          <w:tcPr>
-            <w:tcW w:type="dxa" w:w="1440"/>
-          </w:tcPr>
-          <w:p>
-            <w:r>
-              <w:t>ASCON-AEAD128</w:t>
+              <w:t>interop__CHACHA20-256</w:t>
+            </w:r>
+          </w:p>
+        </w:tc>
+        <w:tc>
+          <w:tcPr>
+            <w:tcW w:type="dxa" w:w="1440"/>
+          </w:tcPr>
+          <w:p>
+            <w:r>
+              <w:t>CHACHA20-256</w:t>
             </w:r>
           </w:p>
         </w:tc>
@@ -20613,7 +20613,7 @@
           </w:tcPr>
           <w:p>
             <w:r>
-              <w:t>1fb82808f12f36ac…</w:t>
+              <w:t>054e751a40f0d48f…</w:t>
             </w:r>
           </w:p>
         </w:tc>
@@ -20625,17 +20625,17 @@
           </w:tcPr>
           <w:p>
             <w:r>
-              <w:t>interop__BLAKE2B-512</w:t>
-            </w:r>
-          </w:p>
-        </w:tc>
-        <w:tc>
-          <w:tcPr>
-            <w:tcW w:type="dxa" w:w="1440"/>
-          </w:tcPr>
-          <w:p>
-            <w:r>
-              <w:t>BLAKE2B-512</w:t>
+              <w:t>interop__CHACHA20-POLY1305</w:t>
+            </w:r>
+          </w:p>
+        </w:tc>
+        <w:tc>
+          <w:tcPr>
+            <w:tcW w:type="dxa" w:w="1440"/>
+          </w:tcPr>
+          <w:p>
+            <w:r>
+              <w:t>CHACHA20-POLY1305</w:t>
             </w:r>
           </w:p>
         </w:tc>
@@ -20675,7 +20675,7 @@
           </w:tcPr>
           <w:p>
             <w:r>
-              <w:t>b63c4650023015f8…</w:t>
+              <w:t>5ddae08d4b537842…</w:t>
             </w:r>
           </w:p>
         </w:tc>
@@ -20687,17 +20687,17 @@
           </w:tcPr>
           <w:p>
             <w:r>
-              <w:t>interop__CHACHA20-256</w:t>
-            </w:r>
-          </w:p>
-        </w:tc>
-        <w:tc>
-          <w:tcPr>
-            <w:tcW w:type="dxa" w:w="1440"/>
-          </w:tcPr>
-          <w:p>
-            <w:r>
-              <w:t>CHACHA20-256</w:t>
+              <w:t>interop__CMAC-AES-128</w:t>
+            </w:r>
+          </w:p>
+        </w:tc>
+        <w:tc>
+          <w:tcPr>
+            <w:tcW w:type="dxa" w:w="1440"/>
+          </w:tcPr>
+          <w:p>
+            <w:r>
+              <w:t>CMAC-AES-128</w:t>
             </w:r>
           </w:p>
         </w:tc>
@@ -20737,7 +20737,7 @@
           </w:tcPr>
           <w:p>
             <w:r>
-              <w:t>054e751a40f0d48f…</w:t>
+              <w:t>d052cb67251760f6…</w:t>
             </w:r>
           </w:p>
         </w:tc>
@@ -20749,17 +20749,17 @@
           </w:tcPr>
           <w:p>
             <w:r>
-              <w:t>interop__CHACHA20-POLY1305</w:t>
-            </w:r>
-          </w:p>
-        </w:tc>
-        <w:tc>
-          <w:tcPr>
-            <w:tcW w:type="dxa" w:w="1440"/>
-          </w:tcPr>
-          <w:p>
-            <w:r>
-              <w:t>CHACHA20-POLY1305</w:t>
+              <w:t>interop__CTR-DRBG-AES-256</w:t>
+            </w:r>
+          </w:p>
+        </w:tc>
+        <w:tc>
+          <w:tcPr>
+            <w:tcW w:type="dxa" w:w="1440"/>
+          </w:tcPr>
+          <w:p>
+            <w:r>
+              <w:t>CTR-DRBG-AES-256</w:t>
             </w:r>
           </w:p>
         </w:tc>
@@ -20799,7 +20799,7 @@
           </w:tcPr>
           <w:p>
             <w:r>
-              <w:t>5ddae08d4b537842…</w:t>
+              <w:t>73d50793fd23436e…</w:t>
             </w:r>
           </w:p>
         </w:tc>
@@ -20811,17 +20811,17 @@
           </w:tcPr>
           <w:p>
             <w:r>
-              <w:t>interop__CMAC-AES-128</w:t>
-            </w:r>
-          </w:p>
-        </w:tc>
-        <w:tc>
-          <w:tcPr>
-            <w:tcW w:type="dxa" w:w="1440"/>
-          </w:tcPr>
-          <w:p>
-            <w:r>
-              <w:t>CMAC-AES-128</w:t>
+              <w:t>interop__ECDH-P384</w:t>
+            </w:r>
+          </w:p>
+        </w:tc>
+        <w:tc>
+          <w:tcPr>
+            <w:tcW w:type="dxa" w:w="1440"/>
+          </w:tcPr>
+          <w:p>
+            <w:r>
+              <w:t>ECDH-P384</w:t>
             </w:r>
           </w:p>
         </w:tc>
@@ -20861,7 +20861,7 @@
           </w:tcPr>
           <w:p>
             <w:r>
-              <w:t>d052cb67251760f6…</w:t>
+              <w:t>f77fc68abcf96e77…</w:t>
             </w:r>
           </w:p>
         </w:tc>
@@ -20873,17 +20873,17 @@
           </w:tcPr>
           <w:p>
             <w:r>
-              <w:t>interop__CTR-DRBG-AES-256</w:t>
-            </w:r>
-          </w:p>
-        </w:tc>
-        <w:tc>
-          <w:tcPr>
-            <w:tcW w:type="dxa" w:w="1440"/>
-          </w:tcPr>
-          <w:p>
-            <w:r>
-              <w:t>CTR-DRBG-AES-256</w:t>
+              <w:t>interop__ECDSA-P256</w:t>
+            </w:r>
+          </w:p>
+        </w:tc>
+        <w:tc>
+          <w:tcPr>
+            <w:tcW w:type="dxa" w:w="1440"/>
+          </w:tcPr>
+          <w:p>
+            <w:r>
+              <w:t>ECDSA-P256</w:t>
             </w:r>
           </w:p>
         </w:tc>
@@ -20923,7 +20923,7 @@
           </w:tcPr>
           <w:p>
             <w:r>
-              <w:t>73d50793fd23436e…</w:t>
+              <w:t>fcaadd1b30e48dba…</w:t>
             </w:r>
           </w:p>
         </w:tc>
@@ -20935,17 +20935,17 @@
           </w:tcPr>
           <w:p>
             <w:r>
-              <w:t>interop__ECDH-P384</w:t>
-            </w:r>
-          </w:p>
-        </w:tc>
-        <w:tc>
-          <w:tcPr>
-            <w:tcW w:type="dxa" w:w="1440"/>
-          </w:tcPr>
-          <w:p>
-            <w:r>
-              <w:t>ECDH-P384</w:t>
+              <w:t>interop__ECDSA-P384</w:t>
+            </w:r>
+          </w:p>
+        </w:tc>
+        <w:tc>
+          <w:tcPr>
+            <w:tcW w:type="dxa" w:w="1440"/>
+          </w:tcPr>
+          <w:p>
+            <w:r>
+              <w:t>ECDSA-P384</w:t>
             </w:r>
           </w:p>
         </w:tc>
@@ -20985,7 +20985,7 @@
           </w:tcPr>
           <w:p>
             <w:r>
-              <w:t>f77fc68abcf96e77…</w:t>
+              <w:t>b69dd3a4b9d29cf3…</w:t>
             </w:r>
           </w:p>
         </w:tc>
@@ -20997,17 +20997,17 @@
           </w:tcPr>
           <w:p>
             <w:r>
-              <w:t>interop__ECDSA-P256</w:t>
-            </w:r>
-          </w:p>
-        </w:tc>
-        <w:tc>
-          <w:tcPr>
-            <w:tcW w:type="dxa" w:w="1440"/>
-          </w:tcPr>
-          <w:p>
-            <w:r>
-              <w:t>ECDSA-P256</w:t>
+              <w:t>interop__ED25519</w:t>
+            </w:r>
+          </w:p>
+        </w:tc>
+        <w:tc>
+          <w:tcPr>
+            <w:tcW w:type="dxa" w:w="1440"/>
+          </w:tcPr>
+          <w:p>
+            <w:r>
+              <w:t>ED25519</w:t>
             </w:r>
           </w:p>
         </w:tc>
@@ -21047,7 +21047,7 @@
           </w:tcPr>
           <w:p>
             <w:r>
-              <w:t>fcaadd1b30e48dba…</w:t>
+              <w:t>3513fbebb7d26dc8…</w:t>
             </w:r>
           </w:p>
         </w:tc>
@@ -21059,17 +21059,17 @@
           </w:tcPr>
           <w:p>
             <w:r>
-              <w:t>interop__ECDSA-P384</w:t>
-            </w:r>
-          </w:p>
-        </w:tc>
-        <w:tc>
-          <w:tcPr>
-            <w:tcW w:type="dxa" w:w="1440"/>
-          </w:tcPr>
-          <w:p>
-            <w:r>
-              <w:t>ECDSA-P384</w:t>
+              <w:t>interop__FFDHE3072</w:t>
+            </w:r>
+          </w:p>
+        </w:tc>
+        <w:tc>
+          <w:tcPr>
+            <w:tcW w:type="dxa" w:w="1440"/>
+          </w:tcPr>
+          <w:p>
+            <w:r>
+              <w:t>FFDHE3072</w:t>
             </w:r>
           </w:p>
         </w:tc>
@@ -21109,7 +21109,7 @@
           </w:tcPr>
           <w:p>
             <w:r>
-              <w:t>b69dd3a4b9d29cf3…</w:t>
+              <w:t>635a4b705a124e7c…</w:t>
             </w:r>
           </w:p>
         </w:tc>
@@ -21121,17 +21121,17 @@
           </w:tcPr>
           <w:p>
             <w:r>
-              <w:t>interop__ED25519</w:t>
-            </w:r>
-          </w:p>
-        </w:tc>
-        <w:tc>
-          <w:tcPr>
-            <w:tcW w:type="dxa" w:w="1440"/>
-          </w:tcPr>
-          <w:p>
-            <w:r>
-              <w:t>ED25519</w:t>
+              <w:t>interop__HMAC-SHA-256-K128</w:t>
+            </w:r>
+          </w:p>
+        </w:tc>
+        <w:tc>
+          <w:tcPr>
+            <w:tcW w:type="dxa" w:w="1440"/>
+          </w:tcPr>
+          <w:p>
+            <w:r>
+              <w:t>HMAC-SHA-256-K128</w:t>
             </w:r>
           </w:p>
         </w:tc>
@@ -21171,7 +21171,7 @@
           </w:tcPr>
           <w:p>
             <w:r>
-              <w:t>3513fbebb7d26dc8…</w:t>
+              <w:t>5105bad5c4d3dd3f…</w:t>
             </w:r>
           </w:p>
         </w:tc>
@@ -21183,17 +21183,17 @@
           </w:tcPr>
           <w:p>
             <w:r>
-              <w:t>interop__FFDHE3072</w:t>
-            </w:r>
-          </w:p>
-        </w:tc>
-        <w:tc>
-          <w:tcPr>
-            <w:tcW w:type="dxa" w:w="1440"/>
-          </w:tcPr>
-          <w:p>
-            <w:r>
-              <w:t>FFDHE3072</w:t>
+              <w:t>interop__HMAC-SHA-256-K256</w:t>
+            </w:r>
+          </w:p>
+        </w:tc>
+        <w:tc>
+          <w:tcPr>
+            <w:tcW w:type="dxa" w:w="1440"/>
+          </w:tcPr>
+          <w:p>
+            <w:r>
+              <w:t>HMAC-SHA-256-K256</w:t>
             </w:r>
           </w:p>
         </w:tc>
@@ -21233,7 +21233,7 @@
           </w:tcPr>
           <w:p>
             <w:r>
-              <w:t>635a4b705a124e7c…</w:t>
+              <w:t>de81c56a27b1e18e…</w:t>
             </w:r>
           </w:p>
         </w:tc>
@@ -21245,17 +21245,17 @@
           </w:tcPr>
           <w:p>
             <w:r>
-              <w:t>interop__HMAC-SHA-256-K128</w:t>
-            </w:r>
-          </w:p>
-        </w:tc>
-        <w:tc>
-          <w:tcPr>
-            <w:tcW w:type="dxa" w:w="1440"/>
-          </w:tcPr>
-          <w:p>
-            <w:r>
-              <w:t>HMAC-SHA-256-K128</w:t>
+              <w:t>interop__ML-DSA-65</w:t>
+            </w:r>
+          </w:p>
+        </w:tc>
+        <w:tc>
+          <w:tcPr>
+            <w:tcW w:type="dxa" w:w="1440"/>
+          </w:tcPr>
+          <w:p>
+            <w:r>
+              <w:t>ML-DSA-65</w:t>
             </w:r>
           </w:p>
         </w:tc>
@@ -21295,7 +21295,7 @@
           </w:tcPr>
           <w:p>
             <w:r>
-              <w:t>5105bad5c4d3dd3f…</w:t>
+              <w:t>a4c671c11f0cd71a…</w:t>
             </w:r>
           </w:p>
         </w:tc>
@@ -21307,17 +21307,17 @@
           </w:tcPr>
           <w:p>
             <w:r>
-              <w:t>interop__HMAC-SHA-256-K256</w:t>
-            </w:r>
-          </w:p>
-        </w:tc>
-        <w:tc>
-          <w:tcPr>
-            <w:tcW w:type="dxa" w:w="1440"/>
-          </w:tcPr>
-          <w:p>
-            <w:r>
-              <w:t>HMAC-SHA-256-K256</w:t>
+              <w:t>interop__ML-KEM-768</w:t>
+            </w:r>
+          </w:p>
+        </w:tc>
+        <w:tc>
+          <w:tcPr>
+            <w:tcW w:type="dxa" w:w="1440"/>
+          </w:tcPr>
+          <w:p>
+            <w:r>
+              <w:t>ML-KEM-768</w:t>
             </w:r>
           </w:p>
         </w:tc>
@@ -21357,7 +21357,7 @@
           </w:tcPr>
           <w:p>
             <w:r>
-              <w:t>de81c56a27b1e18e…</w:t>
+              <w:t>7b20edd23004b0e1…</w:t>
             </w:r>
           </w:p>
         </w:tc>
@@ -21369,17 +21369,17 @@
           </w:tcPr>
           <w:p>
             <w:r>
-              <w:t>interop__ML-DSA-65</w:t>
-            </w:r>
-          </w:p>
-        </w:tc>
-        <w:tc>
-          <w:tcPr>
-            <w:tcW w:type="dxa" w:w="1440"/>
-          </w:tcPr>
-          <w:p>
-            <w:r>
-              <w:t>ML-DSA-65</w:t>
+              <w:t>interop__PRESENT-80</w:t>
+            </w:r>
+          </w:p>
+        </w:tc>
+        <w:tc>
+          <w:tcPr>
+            <w:tcW w:type="dxa" w:w="1440"/>
+          </w:tcPr>
+          <w:p>
+            <w:r>
+              <w:t>PRESENT-80</w:t>
             </w:r>
           </w:p>
         </w:tc>
@@ -21419,7 +21419,7 @@
           </w:tcPr>
           <w:p>
             <w:r>
-              <w:t>a4c671c11f0cd71a…</w:t>
+              <w:t>28430839e4828dbb…</w:t>
             </w:r>
           </w:p>
         </w:tc>
@@ -21431,17 +21431,17 @@
           </w:tcPr>
           <w:p>
             <w:r>
-              <w:t>interop__ML-KEM-768</w:t>
-            </w:r>
-          </w:p>
-        </w:tc>
-        <w:tc>
-          <w:tcPr>
-            <w:tcW w:type="dxa" w:w="1440"/>
-          </w:tcPr>
-          <w:p>
-            <w:r>
-              <w:t>ML-KEM-768</w:t>
+              <w:t>interop__RSA-OAEP-2048</w:t>
+            </w:r>
+          </w:p>
+        </w:tc>
+        <w:tc>
+          <w:tcPr>
+            <w:tcW w:type="dxa" w:w="1440"/>
+          </w:tcPr>
+          <w:p>
+            <w:r>
+              <w:t>RSA-OAEP-2048</w:t>
             </w:r>
           </w:p>
         </w:tc>
@@ -21481,7 +21481,7 @@
           </w:tcPr>
           <w:p>
             <w:r>
-              <w:t>7b20edd23004b0e1…</w:t>
+              <w:t>31ddb1a864e3b4f3…</w:t>
             </w:r>
           </w:p>
         </w:tc>
@@ -21493,17 +21493,17 @@
           </w:tcPr>
           <w:p>
             <w:r>
-              <w:t>interop__PRESENT-80</w:t>
-            </w:r>
-          </w:p>
-        </w:tc>
-        <w:tc>
-          <w:tcPr>
-            <w:tcW w:type="dxa" w:w="1440"/>
-          </w:tcPr>
-          <w:p>
-            <w:r>
-              <w:t>PRESENT-80</w:t>
+              <w:t>interop__RSA-OAEP-3072</w:t>
+            </w:r>
+          </w:p>
+        </w:tc>
+        <w:tc>
+          <w:tcPr>
+            <w:tcW w:type="dxa" w:w="1440"/>
+          </w:tcPr>
+          <w:p>
+            <w:r>
+              <w:t>RSA-OAEP-3072</w:t>
             </w:r>
           </w:p>
         </w:tc>
@@ -21543,7 +21543,7 @@
           </w:tcPr>
           <w:p>
             <w:r>
-              <w:t>28430839e4828dbb…</w:t>
+              <w:t>7d91d90f7601942b…</w:t>
             </w:r>
           </w:p>
         </w:tc>
@@ -21555,17 +21555,17 @@
           </w:tcPr>
           <w:p>
             <w:r>
-              <w:t>interop__RSA-OAEP-2048</w:t>
-            </w:r>
-          </w:p>
-        </w:tc>
-        <w:tc>
-          <w:tcPr>
-            <w:tcW w:type="dxa" w:w="1440"/>
-          </w:tcPr>
-          <w:p>
-            <w:r>
-              <w:t>RSA-OAEP-2048</w:t>
+              <w:t>interop__RSA-PSS-3072</w:t>
+            </w:r>
+          </w:p>
+        </w:tc>
+        <w:tc>
+          <w:tcPr>
+            <w:tcW w:type="dxa" w:w="1440"/>
+          </w:tcPr>
+          <w:p>
+            <w:r>
+              <w:t>RSA-PSS-3072</w:t>
             </w:r>
           </w:p>
         </w:tc>
@@ -21605,7 +21605,7 @@
           </w:tcPr>
           <w:p>
             <w:r>
-              <w:t>31ddb1a864e3b4f3…</w:t>
+              <w:t>39d62bfc79ad1a0e…</w:t>
             </w:r>
           </w:p>
         </w:tc>
@@ -21617,17 +21617,17 @@
           </w:tcPr>
           <w:p>
             <w:r>
-              <w:t>interop__RSA-OAEP-3072</w:t>
-            </w:r>
-          </w:p>
-        </w:tc>
-        <w:tc>
-          <w:tcPr>
-            <w:tcW w:type="dxa" w:w="1440"/>
-          </w:tcPr>
-          <w:p>
-            <w:r>
-              <w:t>RSA-OAEP-3072</w:t>
+              <w:t>interop__RSAES-PKCS1-V1_5-1024</w:t>
+            </w:r>
+          </w:p>
+        </w:tc>
+        <w:tc>
+          <w:tcPr>
+            <w:tcW w:type="dxa" w:w="1440"/>
+          </w:tcPr>
+          <w:p>
+            <w:r>
+              <w:t>RSAES-PKCS1-V1_5-1024</w:t>
             </w:r>
           </w:p>
         </w:tc>
@@ -21667,7 +21667,7 @@
           </w:tcPr>
           <w:p>
             <w:r>
-              <w:t>7d91d90f7601942b…</w:t>
+              <w:t>fed15dba7517f114…</w:t>
             </w:r>
           </w:p>
         </w:tc>
@@ -21679,17 +21679,17 @@
           </w:tcPr>
           <w:p>
             <w:r>
-              <w:t>interop__RSA-PSS-3072</w:t>
-            </w:r>
-          </w:p>
-        </w:tc>
-        <w:tc>
-          <w:tcPr>
-            <w:tcW w:type="dxa" w:w="1440"/>
-          </w:tcPr>
-          <w:p>
-            <w:r>
-              <w:t>RSA-PSS-3072</w:t>
+              <w:t>interop__SHA-1</w:t>
+            </w:r>
+          </w:p>
+        </w:tc>
+        <w:tc>
+          <w:tcPr>
+            <w:tcW w:type="dxa" w:w="1440"/>
+          </w:tcPr>
+          <w:p>
+            <w:r>
+              <w:t>SHA-1</w:t>
             </w:r>
           </w:p>
         </w:tc>
@@ -21729,7 +21729,7 @@
           </w:tcPr>
           <w:p>
             <w:r>
-              <w:t>39d62bfc79ad1a0e…</w:t>
+              <w:t>64b32c674a6b7946…</w:t>
             </w:r>
           </w:p>
         </w:tc>
@@ -21741,17 +21741,17 @@
           </w:tcPr>
           <w:p>
             <w:r>
-              <w:t>interop__RSAES-PKCS1-V1_5-1024</w:t>
-            </w:r>
-          </w:p>
-        </w:tc>
-        <w:tc>
-          <w:tcPr>
-            <w:tcW w:type="dxa" w:w="1440"/>
-          </w:tcPr>
-          <w:p>
-            <w:r>
-              <w:t>RSAES-PKCS1-V1_5-1024</w:t>
+              <w:t>interop__SHA-256</w:t>
+            </w:r>
+          </w:p>
+        </w:tc>
+        <w:tc>
+          <w:tcPr>
+            <w:tcW w:type="dxa" w:w="1440"/>
+          </w:tcPr>
+          <w:p>
+            <w:r>
+              <w:t>SHA-256</w:t>
             </w:r>
           </w:p>
         </w:tc>
@@ -21791,7 +21791,7 @@
           </w:tcPr>
           <w:p>
             <w:r>
-              <w:t>fed15dba7517f114…</w:t>
+              <w:t>7201df6e641b2a4f…</w:t>
             </w:r>
           </w:p>
         </w:tc>
@@ -21803,17 +21803,17 @@
           </w:tcPr>
           <w:p>
             <w:r>
-              <w:t>interop__SHA-1</w:t>
-            </w:r>
-          </w:p>
-        </w:tc>
-        <w:tc>
-          <w:tcPr>
-            <w:tcW w:type="dxa" w:w="1440"/>
-          </w:tcPr>
-          <w:p>
-            <w:r>
-              <w:t>SHA-1</w:t>
+              <w:t>interop__SHA-384</w:t>
+            </w:r>
+          </w:p>
+        </w:tc>
+        <w:tc>
+          <w:tcPr>
+            <w:tcW w:type="dxa" w:w="1440"/>
+          </w:tcPr>
+          <w:p>
+            <w:r>
+              <w:t>SHA-384</w:t>
             </w:r>
           </w:p>
         </w:tc>
@@ -21853,7 +21853,7 @@
           </w:tcPr>
           <w:p>
             <w:r>
-              <w:t>64b32c674a6b7946…</w:t>
+              <w:t>65563f7481293e7a…</w:t>
             </w:r>
           </w:p>
         </w:tc>
@@ -21865,17 +21865,17 @@
           </w:tcPr>
           <w:p>
             <w:r>
-              <w:t>interop__SHA-256</w:t>
-            </w:r>
-          </w:p>
-        </w:tc>
-        <w:tc>
-          <w:tcPr>
-            <w:tcW w:type="dxa" w:w="1440"/>
-          </w:tcPr>
-          <w:p>
-            <w:r>
-              <w:t>SHA-256</w:t>
+              <w:t>interop__SHA-512_256</w:t>
+            </w:r>
+          </w:p>
+        </w:tc>
+        <w:tc>
+          <w:tcPr>
+            <w:tcW w:type="dxa" w:w="1440"/>
+          </w:tcPr>
+          <w:p>
+            <w:r>
+              <w:t>SHA-512/256</w:t>
             </w:r>
           </w:p>
         </w:tc>
@@ -21915,7 +21915,7 @@
           </w:tcPr>
           <w:p>
             <w:r>
-              <w:t>7201df6e641b2a4f…</w:t>
+              <w:t>292f1041299f25b9…</w:t>
             </w:r>
           </w:p>
         </w:tc>
@@ -21927,17 +21927,17 @@
           </w:tcPr>
           <w:p>
             <w:r>
-              <w:t>interop__SHA-384</w:t>
-            </w:r>
-          </w:p>
-        </w:tc>
-        <w:tc>
-          <w:tcPr>
-            <w:tcW w:type="dxa" w:w="1440"/>
-          </w:tcPr>
-          <w:p>
-            <w:r>
-              <w:t>SHA-384</w:t>
+              <w:t>interop__SHA3-256</w:t>
+            </w:r>
+          </w:p>
+        </w:tc>
+        <w:tc>
+          <w:tcPr>
+            <w:tcW w:type="dxa" w:w="1440"/>
+          </w:tcPr>
+          <w:p>
+            <w:r>
+              <w:t>SHA3-256</w:t>
             </w:r>
           </w:p>
         </w:tc>
@@ -21977,7 +21977,7 @@
           </w:tcPr>
           <w:p>
             <w:r>
-              <w:t>65563f7481293e7a…</w:t>
+              <w:t>6ef15dab85c09669…</w:t>
             </w:r>
           </w:p>
         </w:tc>
@@ -21989,17 +21989,17 @@
           </w:tcPr>
           <w:p>
             <w:r>
-              <w:t>interop__SHA-512_256</w:t>
-            </w:r>
-          </w:p>
-        </w:tc>
-        <w:tc>
-          <w:tcPr>
-            <w:tcW w:type="dxa" w:w="1440"/>
-          </w:tcPr>
-          <w:p>
-            <w:r>
-              <w:t>SHA-512/256</w:t>
+              <w:t>interop__SHAKE256</w:t>
+            </w:r>
+          </w:p>
+        </w:tc>
+        <w:tc>
+          <w:tcPr>
+            <w:tcW w:type="dxa" w:w="1440"/>
+          </w:tcPr>
+          <w:p>
+            <w:r>
+              <w:t>SHAKE256</w:t>
             </w:r>
           </w:p>
         </w:tc>
@@ -22039,7 +22039,7 @@
           </w:tcPr>
           <w:p>
             <w:r>
-              <w:t>292f1041299f25b9…</w:t>
+              <w:t>6eec26c4f4fd9830…</w:t>
             </w:r>
           </w:p>
         </w:tc>
@@ -22051,17 +22051,17 @@
           </w:tcPr>
           <w:p>
             <w:r>
-              <w:t>interop__SHA3-256</w:t>
-            </w:r>
-          </w:p>
-        </w:tc>
-        <w:tc>
-          <w:tcPr>
-            <w:tcW w:type="dxa" w:w="1440"/>
-          </w:tcPr>
-          <w:p>
-            <w:r>
-              <w:t>SHA3-256</w:t>
+              <w:t>interop__SLH-DSA-SHA2-128S</w:t>
+            </w:r>
+          </w:p>
+        </w:tc>
+        <w:tc>
+          <w:tcPr>
+            <w:tcW w:type="dxa" w:w="1440"/>
+          </w:tcPr>
+          <w:p>
+            <w:r>
+              <w:t>SLH-DSA-SHA2-128S</w:t>
             </w:r>
           </w:p>
         </w:tc>
@@ -22101,7 +22101,7 @@
           </w:tcPr>
           <w:p>
             <w:r>
-              <w:t>6ef15dab85c09669…</w:t>
+              <w:t>ba0dc1d75beab4a5…</w:t>
             </w:r>
           </w:p>
         </w:tc>
@@ -22113,17 +22113,17 @@
           </w:tcPr>
           <w:p>
             <w:r>
-              <w:t>interop__SHAKE256</w:t>
-            </w:r>
-          </w:p>
-        </w:tc>
-        <w:tc>
-          <w:tcPr>
-            <w:tcW w:type="dxa" w:w="1440"/>
-          </w:tcPr>
-          <w:p>
-            <w:r>
-              <w:t>SHAKE256</w:t>
+              <w:t>interop__TDEA-3KEY</w:t>
+            </w:r>
+          </w:p>
+        </w:tc>
+        <w:tc>
+          <w:tcPr>
+            <w:tcW w:type="dxa" w:w="1440"/>
+          </w:tcPr>
+          <w:p>
+            <w:r>
+              <w:t>TDEA-3KEY</w:t>
             </w:r>
           </w:p>
         </w:tc>
@@ -22163,7 +22163,7 @@
           </w:tcPr>
           <w:p>
             <w:r>
-              <w:t>6eec26c4f4fd9830…</w:t>
+              <w:t>f92b09bfb1d0d472…</w:t>
             </w:r>
           </w:p>
         </w:tc>
@@ -22175,17 +22175,17 @@
           </w:tcPr>
           <w:p>
             <w:r>
-              <w:t>interop__SLH-DSA-SHA2-128S</w:t>
-            </w:r>
-          </w:p>
-        </w:tc>
-        <w:tc>
-          <w:tcPr>
-            <w:tcW w:type="dxa" w:w="1440"/>
-          </w:tcPr>
-          <w:p>
-            <w:r>
-              <w:t>SLH-DSA-SHA2-128S</w:t>
+              <w:t>interop__X25519</w:t>
+            </w:r>
+          </w:p>
+        </w:tc>
+        <w:tc>
+          <w:tcPr>
+            <w:tcW w:type="dxa" w:w="1440"/>
+          </w:tcPr>
+          <w:p>
+            <w:r>
+              <w:t>X25519</w:t>
             </w:r>
           </w:p>
         </w:tc>
@@ -22225,7 +22225,7 @@
           </w:tcPr>
           <w:p>
             <w:r>
-              <w:t>ba0dc1d75beab4a5…</w:t>
+              <w:t>63564c0a3c90999a…</w:t>
             </w:r>
           </w:p>
         </w:tc>
@@ -22237,17 +22237,17 @@
           </w:tcPr>
           <w:p>
             <w:r>
-              <w:t>interop__TDEA-3KEY</w:t>
-            </w:r>
-          </w:p>
-        </w:tc>
-        <w:tc>
-          <w:tcPr>
-            <w:tcW w:type="dxa" w:w="1440"/>
-          </w:tcPr>
-          <w:p>
-            <w:r>
-              <w:t>TDEA-3KEY</w:t>
+              <w:t>interop__XTS-AES-256</w:t>
+            </w:r>
+          </w:p>
+        </w:tc>
+        <w:tc>
+          <w:tcPr>
+            <w:tcW w:type="dxa" w:w="1440"/>
+          </w:tcPr>
+          <w:p>
+            <w:r>
+              <w:t>XTS-AES-256</w:t>
             </w:r>
           </w:p>
         </w:tc>
@@ -22287,7 +22287,7 @@
           </w:tcPr>
           <w:p>
             <w:r>
-              <w:t>f92b09bfb1d0d472…</w:t>
+              <w:t>34f88aa2ee19f470…</w:t>
             </w:r>
           </w:p>
         </w:tc>
@@ -22299,17 +22299,17 @@
           </w:tcPr>
           <w:p>
             <w:r>
-              <w:t>interop__X25519</w:t>
-            </w:r>
-          </w:p>
-        </w:tc>
-        <w:tc>
-          <w:tcPr>
-            <w:tcW w:type="dxa" w:w="1440"/>
-          </w:tcPr>
-          <w:p>
-            <w:r>
-              <w:t>X25519</w:t>
+              <w:t>kat__ASCON-AEAD128</w:t>
+            </w:r>
+          </w:p>
+        </w:tc>
+        <w:tc>
+          <w:tcPr>
+            <w:tcW w:type="dxa" w:w="1440"/>
+          </w:tcPr>
+          <w:p>
+            <w:r>
+              <w:t>ASCON-AEAD128</w:t>
             </w:r>
           </w:p>
         </w:tc>
@@ -22329,7 +22329,7 @@
           </w:tcPr>
           <w:p>
             <w:r>
-              <w:t>KRITERIA</w:t>
+              <w:t>PERLU_VERIFIKASI</w:t>
             </w:r>
           </w:p>
         </w:tc>
@@ -22349,7 +22349,7 @@
           </w:tcPr>
           <w:p>
             <w:r>
-              <w:t>63564c0a3c90999a…</w:t>
+              <w:t>b4aec655b41f4f0f…</w:t>
             </w:r>
           </w:p>
         </w:tc>
@@ -22361,17 +22361,17 @@
           </w:tcPr>
           <w:p>
             <w:r>
-              <w:t>interop__XTS-AES-256</w:t>
-            </w:r>
-          </w:p>
-        </w:tc>
-        <w:tc>
-          <w:tcPr>
-            <w:tcW w:type="dxa" w:w="1440"/>
-          </w:tcPr>
-          <w:p>
-            <w:r>
-              <w:t>XTS-AES-256</w:t>
+              <w:t>kat__FFDHE3072</w:t>
+            </w:r>
+          </w:p>
+        </w:tc>
+        <w:tc>
+          <w:tcPr>
+            <w:tcW w:type="dxa" w:w="1440"/>
+          </w:tcPr>
+          <w:p>
+            <w:r>
+              <w:t>FFDHE3072</w:t>
             </w:r>
           </w:p>
         </w:tc>
@@ -22391,7 +22391,7 @@
           </w:tcPr>
           <w:p>
             <w:r>
-              <w:t>KRITERIA</w:t>
+              <w:t>PERLU_VERIFIKASI</w:t>
             </w:r>
           </w:p>
         </w:tc>
@@ -22411,7 +22411,7 @@
           </w:tcPr>
           <w:p>
             <w:r>
-              <w:t>34f88aa2ee19f470…</w:t>
+              <w:t>d92594517e9a129a…</w:t>
             </w:r>
           </w:p>
         </w:tc>
@@ -22423,17 +22423,17 @@
           </w:tcPr>
           <w:p>
             <w:r>
-              <w:t>kat__ASCON-AEAD128</w:t>
-            </w:r>
-          </w:p>
-        </w:tc>
-        <w:tc>
-          <w:tcPr>
-            <w:tcW w:type="dxa" w:w="1440"/>
-          </w:tcPr>
-          <w:p>
-            <w:r>
-              <w:t>ASCON-AEAD128</w:t>
+              <w:t>kat__ML-DSA-65</w:t>
+            </w:r>
+          </w:p>
+        </w:tc>
+        <w:tc>
+          <w:tcPr>
+            <w:tcW w:type="dxa" w:w="1440"/>
+          </w:tcPr>
+          <w:p>
+            <w:r>
+              <w:t>ML-DSA-65</w:t>
             </w:r>
           </w:p>
         </w:tc>
@@ -22473,7 +22473,7 @@
           </w:tcPr>
           <w:p>
             <w:r>
-              <w:t>b4aec655b41f4f0f…</w:t>
+              <w:t>6e23bbd13f57f036…</w:t>
             </w:r>
           </w:p>
         </w:tc>
@@ -22485,17 +22485,17 @@
           </w:tcPr>
           <w:p>
             <w:r>
-              <w:t>kat__FFDHE3072</w:t>
-            </w:r>
-          </w:p>
-        </w:tc>
-        <w:tc>
-          <w:tcPr>
-            <w:tcW w:type="dxa" w:w="1440"/>
-          </w:tcPr>
-          <w:p>
-            <w:r>
-              <w:t>FFDHE3072</w:t>
+              <w:t>kat__ML-KEM-768</w:t>
+            </w:r>
+          </w:p>
+        </w:tc>
+        <w:tc>
+          <w:tcPr>
+            <w:tcW w:type="dxa" w:w="1440"/>
+          </w:tcPr>
+          <w:p>
+            <w:r>
+              <w:t>ML-KEM-768</w:t>
             </w:r>
           </w:p>
         </w:tc>
@@ -22535,7 +22535,7 @@
           </w:tcPr>
           <w:p>
             <w:r>
-              <w:t>d92594517e9a129a…</w:t>
+              <w:t>e9164ebaad954160…</w:t>
             </w:r>
           </w:p>
         </w:tc>
@@ -22547,17 +22547,17 @@
           </w:tcPr>
           <w:p>
             <w:r>
-              <w:t>kat__ML-DSA-65</w:t>
-            </w:r>
-          </w:p>
-        </w:tc>
-        <w:tc>
-          <w:tcPr>
-            <w:tcW w:type="dxa" w:w="1440"/>
-          </w:tcPr>
-          <w:p>
-            <w:r>
-              <w:t>ML-DSA-65</w:t>
+              <w:t>kat__PRESENT-80</w:t>
+            </w:r>
+          </w:p>
+        </w:tc>
+        <w:tc>
+          <w:tcPr>
+            <w:tcW w:type="dxa" w:w="1440"/>
+          </w:tcPr>
+          <w:p>
+            <w:r>
+              <w:t>PRESENT-80</w:t>
             </w:r>
           </w:p>
         </w:tc>
@@ -22597,7 +22597,7 @@
           </w:tcPr>
           <w:p>
             <w:r>
-              <w:t>6e23bbd13f57f036…</w:t>
+              <w:t>9d773c4c57dcab23…</w:t>
             </w:r>
           </w:p>
         </w:tc>
@@ -22609,17 +22609,17 @@
           </w:tcPr>
           <w:p>
             <w:r>
-              <w:t>kat__ML-KEM-768</w:t>
-            </w:r>
-          </w:p>
-        </w:tc>
-        <w:tc>
-          <w:tcPr>
-            <w:tcW w:type="dxa" w:w="1440"/>
-          </w:tcPr>
-          <w:p>
-            <w:r>
-              <w:t>ML-KEM-768</w:t>
+              <w:t>kat__RSA-PSS-3072</w:t>
+            </w:r>
+          </w:p>
+        </w:tc>
+        <w:tc>
+          <w:tcPr>
+            <w:tcW w:type="dxa" w:w="1440"/>
+          </w:tcPr>
+          <w:p>
+            <w:r>
+              <w:t>RSA-PSS-3072</w:t>
             </w:r>
           </w:p>
         </w:tc>
@@ -22659,7 +22659,7 @@
           </w:tcPr>
           <w:p>
             <w:r>
-              <w:t>e9164ebaad954160…</w:t>
+              <w:t>eb8ac8913dcb8e75…</w:t>
             </w:r>
           </w:p>
         </w:tc>
@@ -22671,17 +22671,17 @@
           </w:tcPr>
           <w:p>
             <w:r>
-              <w:t>kat__PRESENT-80</w:t>
-            </w:r>
-          </w:p>
-        </w:tc>
-        <w:tc>
-          <w:tcPr>
-            <w:tcW w:type="dxa" w:w="1440"/>
-          </w:tcPr>
-          <w:p>
-            <w:r>
-              <w:t>PRESENT-80</w:t>
+              <w:t>kat__RSAES-PKCS1-V1_5-1024</w:t>
+            </w:r>
+          </w:p>
+        </w:tc>
+        <w:tc>
+          <w:tcPr>
+            <w:tcW w:type="dxa" w:w="1440"/>
+          </w:tcPr>
+          <w:p>
+            <w:r>
+              <w:t>RSAES-PKCS1-V1_5-1024</w:t>
             </w:r>
           </w:p>
         </w:tc>
@@ -22721,7 +22721,7 @@
           </w:tcPr>
           <w:p>
             <w:r>
-              <w:t>9d773c4c57dcab23…</w:t>
+              <w:t>a8df90259f7eaaf5…</w:t>
             </w:r>
           </w:p>
         </w:tc>
@@ -22733,17 +22733,17 @@
           </w:tcPr>
           <w:p>
             <w:r>
-              <w:t>kat__RSA-PSS-3072</w:t>
-            </w:r>
-          </w:p>
-        </w:tc>
-        <w:tc>
-          <w:tcPr>
-            <w:tcW w:type="dxa" w:w="1440"/>
-          </w:tcPr>
-          <w:p>
-            <w:r>
-              <w:t>RSA-PSS-3072</w:t>
+              <w:t>kat__SLH-DSA-SHA2-128S</w:t>
+            </w:r>
+          </w:p>
+        </w:tc>
+        <w:tc>
+          <w:tcPr>
+            <w:tcW w:type="dxa" w:w="1440"/>
+          </w:tcPr>
+          <w:p>
+            <w:r>
+              <w:t>SLH-DSA-SHA2-128S</w:t>
             </w:r>
           </w:p>
         </w:tc>
@@ -22783,7 +22783,7 @@
           </w:tcPr>
           <w:p>
             <w:r>
-              <w:t>eb8ac8913dcb8e75…</w:t>
+              <w:t>b9897724352acd34…</w:t>
             </w:r>
           </w:p>
         </w:tc>
@@ -22795,17 +22795,17 @@
           </w:tcPr>
           <w:p>
             <w:r>
-              <w:t>kat__RSAES-PKCS1-V1_5-1024</w:t>
-            </w:r>
-          </w:p>
-        </w:tc>
-        <w:tc>
-          <w:tcPr>
-            <w:tcW w:type="dxa" w:w="1440"/>
-          </w:tcPr>
-          <w:p>
-            <w:r>
-              <w:t>RSAES-PKCS1-V1_5-1024</w:t>
+              <w:t>kat__TDEA-3KEY</w:t>
+            </w:r>
+          </w:p>
+        </w:tc>
+        <w:tc>
+          <w:tcPr>
+            <w:tcW w:type="dxa" w:w="1440"/>
+          </w:tcPr>
+          <w:p>
+            <w:r>
+              <w:t>TDEA-3KEY</w:t>
             </w:r>
           </w:p>
         </w:tc>
@@ -22845,7 +22845,7 @@
           </w:tcPr>
           <w:p>
             <w:r>
-              <w:t>a8df90259f7eaaf5…</w:t>
+              <w:t>780eb3abddbc05c8…</w:t>
             </w:r>
           </w:p>
         </w:tc>
@@ -22857,17 +22857,17 @@
           </w:tcPr>
           <w:p>
             <w:r>
-              <w:t>kat__SLH-DSA-SHA2-128S</w:t>
-            </w:r>
-          </w:p>
-        </w:tc>
-        <w:tc>
-          <w:tcPr>
-            <w:tcW w:type="dxa" w:w="1440"/>
-          </w:tcPr>
-          <w:p>
-            <w:r>
-              <w:t>SLH-DSA-SHA2-128S</w:t>
+              <w:t>kat__XTS-AES-256</w:t>
+            </w:r>
+          </w:p>
+        </w:tc>
+        <w:tc>
+          <w:tcPr>
+            <w:tcW w:type="dxa" w:w="1440"/>
+          </w:tcPr>
+          <w:p>
+            <w:r>
+              <w:t>XTS-AES-256</w:t>
             </w:r>
           </w:p>
         </w:tc>
@@ -22907,7 +22907,7 @@
           </w:tcPr>
           <w:p>
             <w:r>
-              <w:t>b9897724352acd34…</w:t>
+              <w:t>65abad93e93a9dd6…</w:t>
             </w:r>
           </w:p>
         </w:tc>
@@ -22919,17 +22919,17 @@
           </w:tcPr>
           <w:p>
             <w:r>
-              <w:t>kat__TDEA-3KEY</w:t>
-            </w:r>
-          </w:p>
-        </w:tc>
-        <w:tc>
-          <w:tcPr>
-            <w:tcW w:type="dxa" w:w="1440"/>
-          </w:tcPr>
-          <w:p>
-            <w:r>
-              <w:t>TDEA-3KEY</w:t>
+              <w:t>keygen_validate__ECDH-P384</w:t>
+            </w:r>
+          </w:p>
+        </w:tc>
+        <w:tc>
+          <w:tcPr>
+            <w:tcW w:type="dxa" w:w="1440"/>
+          </w:tcPr>
+          <w:p>
+            <w:r>
+              <w:t>ECDH-P384</w:t>
             </w:r>
           </w:p>
         </w:tc>
@@ -22949,7 +22949,7 @@
           </w:tcPr>
           <w:p>
             <w:r>
-              <w:t>PERLU_VERIFIKASI</w:t>
+              <w:t>KRITERIA</w:t>
             </w:r>
           </w:p>
         </w:tc>
@@ -22969,7 +22969,7 @@
           </w:tcPr>
           <w:p>
             <w:r>
-              <w:t>780eb3abddbc05c8…</w:t>
+              <w:t>592ce0b4c7c6918b…</w:t>
             </w:r>
           </w:p>
         </w:tc>
@@ -22981,17 +22981,17 @@
           </w:tcPr>
           <w:p>
             <w:r>
-              <w:t>kat__XTS-AES-256</w:t>
-            </w:r>
-          </w:p>
-        </w:tc>
-        <w:tc>
-          <w:tcPr>
-            <w:tcW w:type="dxa" w:w="1440"/>
-          </w:tcPr>
-          <w:p>
-            <w:r>
-              <w:t>XTS-AES-256</w:t>
+              <w:t>keygen_validate__ECDSA-P256</w:t>
+            </w:r>
+          </w:p>
+        </w:tc>
+        <w:tc>
+          <w:tcPr>
+            <w:tcW w:type="dxa" w:w="1440"/>
+          </w:tcPr>
+          <w:p>
+            <w:r>
+              <w:t>ECDSA-P256</w:t>
             </w:r>
           </w:p>
         </w:tc>
@@ -23011,7 +23011,7 @@
           </w:tcPr>
           <w:p>
             <w:r>
-              <w:t>PERLU_VERIFIKASI</w:t>
+              <w:t>KRITERIA</w:t>
             </w:r>
           </w:p>
         </w:tc>
@@ -23031,7 +23031,7 @@
           </w:tcPr>
           <w:p>
             <w:r>
-              <w:t>65abad93e93a9dd6…</w:t>
+              <w:t>a58409404cdbd688…</w:t>
             </w:r>
           </w:p>
         </w:tc>
@@ -23043,17 +23043,17 @@
           </w:tcPr>
           <w:p>
             <w:r>
-              <w:t>keygen_validate__ECDH-P384</w:t>
-            </w:r>
-          </w:p>
-        </w:tc>
-        <w:tc>
-          <w:tcPr>
-            <w:tcW w:type="dxa" w:w="1440"/>
-          </w:tcPr>
-          <w:p>
-            <w:r>
-              <w:t>ECDH-P384</w:t>
+              <w:t>keygen_validate__ECDSA-P384</w:t>
+            </w:r>
+          </w:p>
+        </w:tc>
+        <w:tc>
+          <w:tcPr>
+            <w:tcW w:type="dxa" w:w="1440"/>
+          </w:tcPr>
+          <w:p>
+            <w:r>
+              <w:t>ECDSA-P384</w:t>
             </w:r>
           </w:p>
         </w:tc>
@@ -23093,7 +23093,7 @@
           </w:tcPr>
           <w:p>
             <w:r>
-              <w:t>592ce0b4c7c6918b…</w:t>
+              <w:t>93cb4069f6cda862…</w:t>
             </w:r>
           </w:p>
         </w:tc>
@@ -23105,17 +23105,17 @@
           </w:tcPr>
           <w:p>
             <w:r>
-              <w:t>keygen_validate__ECDSA-P256</w:t>
-            </w:r>
-          </w:p>
-        </w:tc>
-        <w:tc>
-          <w:tcPr>
-            <w:tcW w:type="dxa" w:w="1440"/>
-          </w:tcPr>
-          <w:p>
-            <w:r>
-              <w:t>ECDSA-P256</w:t>
+              <w:t>keygen_validate__FFDHE3072</w:t>
+            </w:r>
+          </w:p>
+        </w:tc>
+        <w:tc>
+          <w:tcPr>
+            <w:tcW w:type="dxa" w:w="1440"/>
+          </w:tcPr>
+          <w:p>
+            <w:r>
+              <w:t>FFDHE3072</w:t>
             </w:r>
           </w:p>
         </w:tc>
@@ -23155,7 +23155,7 @@
           </w:tcPr>
           <w:p>
             <w:r>
-              <w:t>a58409404cdbd688…</w:t>
+              <w:t>2ac106096ff92687…</w:t>
             </w:r>
           </w:p>
         </w:tc>
@@ -23167,17 +23167,17 @@
           </w:tcPr>
           <w:p>
             <w:r>
-              <w:t>keygen_validate__ECDSA-P384</w:t>
-            </w:r>
-          </w:p>
-        </w:tc>
-        <w:tc>
-          <w:tcPr>
-            <w:tcW w:type="dxa" w:w="1440"/>
-          </w:tcPr>
-          <w:p>
-            <w:r>
-              <w:t>ECDSA-P384</w:t>
+              <w:t>keygen_validate__ML-KEM-768</w:t>
+            </w:r>
+          </w:p>
+        </w:tc>
+        <w:tc>
+          <w:tcPr>
+            <w:tcW w:type="dxa" w:w="1440"/>
+          </w:tcPr>
+          <w:p>
+            <w:r>
+              <w:t>ML-KEM-768</w:t>
             </w:r>
           </w:p>
         </w:tc>
@@ -23217,7 +23217,7 @@
           </w:tcPr>
           <w:p>
             <w:r>
-              <w:t>93cb4069f6cda862…</w:t>
+              <w:t>f31246f1be140cf4…</w:t>
             </w:r>
           </w:p>
         </w:tc>
@@ -23229,17 +23229,17 @@
           </w:tcPr>
           <w:p>
             <w:r>
-              <w:t>keygen_validate__FFDHE3072</w:t>
-            </w:r>
-          </w:p>
-        </w:tc>
-        <w:tc>
-          <w:tcPr>
-            <w:tcW w:type="dxa" w:w="1440"/>
-          </w:tcPr>
-          <w:p>
-            <w:r>
-              <w:t>FFDHE3072</w:t>
+              <w:t>keygen_validate__RSA-OAEP-2048</w:t>
+            </w:r>
+          </w:p>
+        </w:tc>
+        <w:tc>
+          <w:tcPr>
+            <w:tcW w:type="dxa" w:w="1440"/>
+          </w:tcPr>
+          <w:p>
+            <w:r>
+              <w:t>RSA-OAEP-2048</w:t>
             </w:r>
           </w:p>
         </w:tc>
@@ -23279,7 +23279,7 @@
           </w:tcPr>
           <w:p>
             <w:r>
-              <w:t>2ac106096ff92687…</w:t>
+              <w:t>c07f85842fc43cdd…</w:t>
             </w:r>
           </w:p>
         </w:tc>
@@ -23291,17 +23291,17 @@
           </w:tcPr>
           <w:p>
             <w:r>
-              <w:t>keygen_validate__ML-KEM-768</w:t>
-            </w:r>
-          </w:p>
-        </w:tc>
-        <w:tc>
-          <w:tcPr>
-            <w:tcW w:type="dxa" w:w="1440"/>
-          </w:tcPr>
-          <w:p>
-            <w:r>
-              <w:t>ML-KEM-768</w:t>
+              <w:t>keygen_validate__RSA-OAEP-3072</w:t>
+            </w:r>
+          </w:p>
+        </w:tc>
+        <w:tc>
+          <w:tcPr>
+            <w:tcW w:type="dxa" w:w="1440"/>
+          </w:tcPr>
+          <w:p>
+            <w:r>
+              <w:t>RSA-OAEP-3072</w:t>
             </w:r>
           </w:p>
         </w:tc>
@@ -23341,7 +23341,7 @@
           </w:tcPr>
           <w:p>
             <w:r>
-              <w:t>f31246f1be140cf4…</w:t>
+              <w:t>9467999ab8f1d2f6…</w:t>
             </w:r>
           </w:p>
         </w:tc>
@@ -23353,17 +23353,17 @@
           </w:tcPr>
           <w:p>
             <w:r>
-              <w:t>keygen_validate__RSA-OAEP-2048</w:t>
-            </w:r>
-          </w:p>
-        </w:tc>
-        <w:tc>
-          <w:tcPr>
-            <w:tcW w:type="dxa" w:w="1440"/>
-          </w:tcPr>
-          <w:p>
-            <w:r>
-              <w:t>RSA-OAEP-2048</w:t>
+              <w:t>keygen_validate__RSAES-PKCS1-V1_5-1024</w:t>
+            </w:r>
+          </w:p>
+        </w:tc>
+        <w:tc>
+          <w:tcPr>
+            <w:tcW w:type="dxa" w:w="1440"/>
+          </w:tcPr>
+          <w:p>
+            <w:r>
+              <w:t>RSAES-PKCS1-V1_5-1024</w:t>
             </w:r>
           </w:p>
         </w:tc>
@@ -23403,7 +23403,7 @@
           </w:tcPr>
           <w:p>
             <w:r>
-              <w:t>c07f85842fc43cdd…</w:t>
+              <w:t>3adeeee94f0427de…</w:t>
             </w:r>
           </w:p>
         </w:tc>
@@ -23415,17 +23415,17 @@
           </w:tcPr>
           <w:p>
             <w:r>
-              <w:t>keygen_validate__RSA-OAEP-3072</w:t>
-            </w:r>
-          </w:p>
-        </w:tc>
-        <w:tc>
-          <w:tcPr>
-            <w:tcW w:type="dxa" w:w="1440"/>
-          </w:tcPr>
-          <w:p>
-            <w:r>
-              <w:t>RSA-OAEP-3072</w:t>
+              <w:t>keygen_validate__X25519</w:t>
+            </w:r>
+          </w:p>
+        </w:tc>
+        <w:tc>
+          <w:tcPr>
+            <w:tcW w:type="dxa" w:w="1440"/>
+          </w:tcPr>
+          <w:p>
+            <w:r>
+              <w:t>X25519</w:t>
             </w:r>
           </w:p>
         </w:tc>
@@ -23465,7 +23465,7 @@
           </w:tcPr>
           <w:p>
             <w:r>
-              <w:t>9467999ab8f1d2f6…</w:t>
+              <w:t>20cf29f9f9a1eee2…</w:t>
             </w:r>
           </w:p>
         </w:tc>
@@ -23477,17 +23477,17 @@
           </w:tcPr>
           <w:p>
             <w:r>
-              <w:t>keygen_validate__RSAES-PKCS1-V1_5-1024</w:t>
-            </w:r>
-          </w:p>
-        </w:tc>
-        <w:tc>
-          <w:tcPr>
-            <w:tcW w:type="dxa" w:w="1440"/>
-          </w:tcPr>
-          <w:p>
-            <w:r>
-              <w:t>RSAES-PKCS1-V1_5-1024</w:t>
+              <w:t>mct__AES-128-CTR</w:t>
+            </w:r>
+          </w:p>
+        </w:tc>
+        <w:tc>
+          <w:tcPr>
+            <w:tcW w:type="dxa" w:w="1440"/>
+          </w:tcPr>
+          <w:p>
+            <w:r>
+              <w:t>AES-128-CTR</w:t>
             </w:r>
           </w:p>
         </w:tc>
@@ -23527,7 +23527,7 @@
           </w:tcPr>
           <w:p>
             <w:r>
-              <w:t>3adeeee94f0427de…</w:t>
+              <w:t>aa659d2a79441b29…</w:t>
             </w:r>
           </w:p>
         </w:tc>
@@ -23539,17 +23539,17 @@
           </w:tcPr>
           <w:p>
             <w:r>
-              <w:t>keygen_validate__X25519</w:t>
-            </w:r>
-          </w:p>
-        </w:tc>
-        <w:tc>
-          <w:tcPr>
-            <w:tcW w:type="dxa" w:w="1440"/>
-          </w:tcPr>
-          <w:p>
-            <w:r>
-              <w:t>X25519</w:t>
+              <w:t>mct__AES-256-GCM</w:t>
+            </w:r>
+          </w:p>
+        </w:tc>
+        <w:tc>
+          <w:tcPr>
+            <w:tcW w:type="dxa" w:w="1440"/>
+          </w:tcPr>
+          <w:p>
+            <w:r>
+              <w:t>AES-256-GCM</w:t>
             </w:r>
           </w:p>
         </w:tc>
@@ -23589,7 +23589,7 @@
           </w:tcPr>
           <w:p>
             <w:r>
-              <w:t>20cf29f9f9a1eee2…</w:t>
+              <w:t>5909577e4030f3b3…</w:t>
             </w:r>
           </w:p>
         </w:tc>
@@ -23601,17 +23601,17 @@
           </w:tcPr>
           <w:p>
             <w:r>
-              <w:t>mct__AES-128-CTR</w:t>
-            </w:r>
-          </w:p>
-        </w:tc>
-        <w:tc>
-          <w:tcPr>
-            <w:tcW w:type="dxa" w:w="1440"/>
-          </w:tcPr>
-          <w:p>
-            <w:r>
-              <w:t>AES-128-CTR</w:t>
+              <w:t>mct__AES-256-KW</w:t>
+            </w:r>
+          </w:p>
+        </w:tc>
+        <w:tc>
+          <w:tcPr>
+            <w:tcW w:type="dxa" w:w="1440"/>
+          </w:tcPr>
+          <w:p>
+            <w:r>
+              <w:t>AES-256-KW</w:t>
             </w:r>
           </w:p>
         </w:tc>
@@ -23651,7 +23651,7 @@
           </w:tcPr>
           <w:p>
             <w:r>
-              <w:t>aa659d2a79441b29…</w:t>
+              <w:t>2cb481bed5951d09…</w:t>
             </w:r>
           </w:p>
         </w:tc>
@@ -23663,17 +23663,17 @@
           </w:tcPr>
           <w:p>
             <w:r>
-              <w:t>mct__AES-256-GCM</w:t>
-            </w:r>
-          </w:p>
-        </w:tc>
-        <w:tc>
-          <w:tcPr>
-            <w:tcW w:type="dxa" w:w="1440"/>
-          </w:tcPr>
-          <w:p>
-            <w:r>
-              <w:t>AES-256-GCM</w:t>
+              <w:t>mct__ASCON-AEAD128</w:t>
+            </w:r>
+          </w:p>
+        </w:tc>
+        <w:tc>
+          <w:tcPr>
+            <w:tcW w:type="dxa" w:w="1440"/>
+          </w:tcPr>
+          <w:p>
+            <w:r>
+              <w:t>ASCON-AEAD128</w:t>
             </w:r>
           </w:p>
         </w:tc>
@@ -23713,7 +23713,7 @@
           </w:tcPr>
           <w:p>
             <w:r>
-              <w:t>5909577e4030f3b3…</w:t>
+              <w:t>c964919cd4f8010a…</w:t>
             </w:r>
           </w:p>
         </w:tc>
@@ -23725,17 +23725,17 @@
           </w:tcPr>
           <w:p>
             <w:r>
-              <w:t>mct__AES-256-KW</w:t>
-            </w:r>
-          </w:p>
-        </w:tc>
-        <w:tc>
-          <w:tcPr>
-            <w:tcW w:type="dxa" w:w="1440"/>
-          </w:tcPr>
-          <w:p>
-            <w:r>
-              <w:t>AES-256-KW</w:t>
+              <w:t>mct__BLAKE2B-512</w:t>
+            </w:r>
+          </w:p>
+        </w:tc>
+        <w:tc>
+          <w:tcPr>
+            <w:tcW w:type="dxa" w:w="1440"/>
+          </w:tcPr>
+          <w:p>
+            <w:r>
+              <w:t>BLAKE2B-512</w:t>
             </w:r>
           </w:p>
         </w:tc>
@@ -23775,7 +23775,7 @@
           </w:tcPr>
           <w:p>
             <w:r>
-              <w:t>2cb481bed5951d09…</w:t>
+              <w:t>9086f2cccaa99af0…</w:t>
             </w:r>
           </w:p>
         </w:tc>
@@ -23787,17 +23787,17 @@
           </w:tcPr>
           <w:p>
             <w:r>
-              <w:t>mct__ASCON-AEAD128</w:t>
-            </w:r>
-          </w:p>
-        </w:tc>
-        <w:tc>
-          <w:tcPr>
-            <w:tcW w:type="dxa" w:w="1440"/>
-          </w:tcPr>
-          <w:p>
-            <w:r>
-              <w:t>ASCON-AEAD128</w:t>
+              <w:t>mct__CMAC-AES-128</w:t>
+            </w:r>
+          </w:p>
+        </w:tc>
+        <w:tc>
+          <w:tcPr>
+            <w:tcW w:type="dxa" w:w="1440"/>
+          </w:tcPr>
+          <w:p>
+            <w:r>
+              <w:t>CMAC-AES-128</w:t>
             </w:r>
           </w:p>
         </w:tc>
@@ -23837,7 +23837,7 @@
           </w:tcPr>
           <w:p>
             <w:r>
-              <w:t>c964919cd4f8010a…</w:t>
+              <w:t>fc3f5e273dada56f…</w:t>
             </w:r>
           </w:p>
         </w:tc>
@@ -23849,17 +23849,17 @@
           </w:tcPr>
           <w:p>
             <w:r>
-              <w:t>mct__BLAKE2B-512</w:t>
-            </w:r>
-          </w:p>
-        </w:tc>
-        <w:tc>
-          <w:tcPr>
-            <w:tcW w:type="dxa" w:w="1440"/>
-          </w:tcPr>
-          <w:p>
-            <w:r>
-              <w:t>BLAKE2B-512</w:t>
+              <w:t>mct__PRESENT-80</w:t>
+            </w:r>
+          </w:p>
+        </w:tc>
+        <w:tc>
+          <w:tcPr>
+            <w:tcW w:type="dxa" w:w="1440"/>
+          </w:tcPr>
+          <w:p>
+            <w:r>
+              <w:t>PRESENT-80</w:t>
             </w:r>
           </w:p>
         </w:tc>
@@ -23899,7 +23899,7 @@
           </w:tcPr>
           <w:p>
             <w:r>
-              <w:t>9086f2cccaa99af0…</w:t>
+              <w:t>84b6012b5dbf7544…</w:t>
             </w:r>
           </w:p>
         </w:tc>
@@ -23911,17 +23911,17 @@
           </w:tcPr>
           <w:p>
             <w:r>
-              <w:t>mct__CMAC-AES-128</w:t>
-            </w:r>
-          </w:p>
-        </w:tc>
-        <w:tc>
-          <w:tcPr>
-            <w:tcW w:type="dxa" w:w="1440"/>
-          </w:tcPr>
-          <w:p>
-            <w:r>
-              <w:t>CMAC-AES-128</w:t>
+              <w:t>mct__SHA-1</w:t>
+            </w:r>
+          </w:p>
+        </w:tc>
+        <w:tc>
+          <w:tcPr>
+            <w:tcW w:type="dxa" w:w="1440"/>
+          </w:tcPr>
+          <w:p>
+            <w:r>
+              <w:t>SHA-1</w:t>
             </w:r>
           </w:p>
         </w:tc>
@@ -23961,7 +23961,7 @@
           </w:tcPr>
           <w:p>
             <w:r>
-              <w:t>fc3f5e273dada56f…</w:t>
+              <w:t>d69ffe9cad08f642…</w:t>
             </w:r>
           </w:p>
         </w:tc>
@@ -23973,17 +23973,17 @@
           </w:tcPr>
           <w:p>
             <w:r>
-              <w:t>mct__PRESENT-80</w:t>
-            </w:r>
-          </w:p>
-        </w:tc>
-        <w:tc>
-          <w:tcPr>
-            <w:tcW w:type="dxa" w:w="1440"/>
-          </w:tcPr>
-          <w:p>
-            <w:r>
-              <w:t>PRESENT-80</w:t>
+              <w:t>mct__SHA-256</w:t>
+            </w:r>
+          </w:p>
+        </w:tc>
+        <w:tc>
+          <w:tcPr>
+            <w:tcW w:type="dxa" w:w="1440"/>
+          </w:tcPr>
+          <w:p>
+            <w:r>
+              <w:t>SHA-256</w:t>
             </w:r>
           </w:p>
         </w:tc>
@@ -24023,7 +24023,7 @@
           </w:tcPr>
           <w:p>
             <w:r>
-              <w:t>84b6012b5dbf7544…</w:t>
+              <w:t>6bd284dc3043d86a…</w:t>
             </w:r>
           </w:p>
         </w:tc>
@@ -24035,17 +24035,17 @@
           </w:tcPr>
           <w:p>
             <w:r>
-              <w:t>mct__SHA-1</w:t>
-            </w:r>
-          </w:p>
-        </w:tc>
-        <w:tc>
-          <w:tcPr>
-            <w:tcW w:type="dxa" w:w="1440"/>
-          </w:tcPr>
-          <w:p>
-            <w:r>
-              <w:t>SHA-1</w:t>
+              <w:t>mct__SHA-384</w:t>
+            </w:r>
+          </w:p>
+        </w:tc>
+        <w:tc>
+          <w:tcPr>
+            <w:tcW w:type="dxa" w:w="1440"/>
+          </w:tcPr>
+          <w:p>
+            <w:r>
+              <w:t>SHA-384</w:t>
             </w:r>
           </w:p>
         </w:tc>
@@ -24085,7 +24085,7 @@
           </w:tcPr>
           <w:p>
             <w:r>
-              <w:t>d69ffe9cad08f642…</w:t>
+              <w:t>5646a3d56f444350…</w:t>
             </w:r>
           </w:p>
         </w:tc>
@@ -24097,17 +24097,17 @@
           </w:tcPr>
           <w:p>
             <w:r>
-              <w:t>mct__SHA-256</w:t>
-            </w:r>
-          </w:p>
-        </w:tc>
-        <w:tc>
-          <w:tcPr>
-            <w:tcW w:type="dxa" w:w="1440"/>
-          </w:tcPr>
-          <w:p>
-            <w:r>
-              <w:t>SHA-256</w:t>
+              <w:t>mct__SHA-512_256</w:t>
+            </w:r>
+          </w:p>
+        </w:tc>
+        <w:tc>
+          <w:tcPr>
+            <w:tcW w:type="dxa" w:w="1440"/>
+          </w:tcPr>
+          <w:p>
+            <w:r>
+              <w:t>SHA-512/256</w:t>
             </w:r>
           </w:p>
         </w:tc>
@@ -24147,7 +24147,7 @@
           </w:tcPr>
           <w:p>
             <w:r>
-              <w:t>6bd284dc3043d86a…</w:t>
+              <w:t>5ac3f7c21237763e…</w:t>
             </w:r>
           </w:p>
         </w:tc>
@@ -24159,17 +24159,17 @@
           </w:tcPr>
           <w:p>
             <w:r>
-              <w:t>mct__SHA-384</w:t>
-            </w:r>
-          </w:p>
-        </w:tc>
-        <w:tc>
-          <w:tcPr>
-            <w:tcW w:type="dxa" w:w="1440"/>
-          </w:tcPr>
-          <w:p>
-            <w:r>
-              <w:t>SHA-384</w:t>
+              <w:t>mct__SHA3-256</w:t>
+            </w:r>
+          </w:p>
+        </w:tc>
+        <w:tc>
+          <w:tcPr>
+            <w:tcW w:type="dxa" w:w="1440"/>
+          </w:tcPr>
+          <w:p>
+            <w:r>
+              <w:t>SHA3-256</w:t>
             </w:r>
           </w:p>
         </w:tc>
@@ -24209,7 +24209,7 @@
           </w:tcPr>
           <w:p>
             <w:r>
-              <w:t>5646a3d56f444350…</w:t>
+              <w:t>e181093e263e1dee…</w:t>
             </w:r>
           </w:p>
         </w:tc>
@@ -24221,17 +24221,17 @@
           </w:tcPr>
           <w:p>
             <w:r>
-              <w:t>mct__SHA-512_256</w:t>
-            </w:r>
-          </w:p>
-        </w:tc>
-        <w:tc>
-          <w:tcPr>
-            <w:tcW w:type="dxa" w:w="1440"/>
-          </w:tcPr>
-          <w:p>
-            <w:r>
-              <w:t>SHA-512/256</w:t>
+              <w:t>mct__SHAKE256</w:t>
+            </w:r>
+          </w:p>
+        </w:tc>
+        <w:tc>
+          <w:tcPr>
+            <w:tcW w:type="dxa" w:w="1440"/>
+          </w:tcPr>
+          <w:p>
+            <w:r>
+              <w:t>SHAKE256</w:t>
             </w:r>
           </w:p>
         </w:tc>
@@ -24271,7 +24271,7 @@
           </w:tcPr>
           <w:p>
             <w:r>
-              <w:t>5ac3f7c21237763e…</w:t>
+              <w:t>0027c59f3e88f925…</w:t>
             </w:r>
           </w:p>
         </w:tc>
@@ -24283,17 +24283,17 @@
           </w:tcPr>
           <w:p>
             <w:r>
-              <w:t>mct__SHA3-256</w:t>
-            </w:r>
-          </w:p>
-        </w:tc>
-        <w:tc>
-          <w:tcPr>
-            <w:tcW w:type="dxa" w:w="1440"/>
-          </w:tcPr>
-          <w:p>
-            <w:r>
-              <w:t>SHA3-256</w:t>
+              <w:t>mct__TDEA-3KEY</w:t>
+            </w:r>
+          </w:p>
+        </w:tc>
+        <w:tc>
+          <w:tcPr>
+            <w:tcW w:type="dxa" w:w="1440"/>
+          </w:tcPr>
+          <w:p>
+            <w:r>
+              <w:t>TDEA-3KEY</w:t>
             </w:r>
           </w:p>
         </w:tc>
@@ -24333,7 +24333,7 @@
           </w:tcPr>
           <w:p>
             <w:r>
-              <w:t>e181093e263e1dee…</w:t>
+              <w:t>8b1bca6550383d17…</w:t>
             </w:r>
           </w:p>
         </w:tc>
@@ -24345,17 +24345,17 @@
           </w:tcPr>
           <w:p>
             <w:r>
-              <w:t>mct__SHAKE256</w:t>
-            </w:r>
-          </w:p>
-        </w:tc>
-        <w:tc>
-          <w:tcPr>
-            <w:tcW w:type="dxa" w:w="1440"/>
-          </w:tcPr>
-          <w:p>
-            <w:r>
-              <w:t>SHAKE256</w:t>
+              <w:t>mct__XTS-AES-256</w:t>
+            </w:r>
+          </w:p>
+        </w:tc>
+        <w:tc>
+          <w:tcPr>
+            <w:tcW w:type="dxa" w:w="1440"/>
+          </w:tcPr>
+          <w:p>
+            <w:r>
+              <w:t>XTS-AES-256</w:t>
             </w:r>
           </w:p>
         </w:tc>
@@ -24395,7 +24395,7 @@
           </w:tcPr>
           <w:p>
             <w:r>
-              <w:t>0027c59f3e88f925…</w:t>
+              <w:t>3880940fc999f3c2…</w:t>
             </w:r>
           </w:p>
         </w:tc>
@@ -24407,27 +24407,27 @@
           </w:tcPr>
           <w:p>
             <w:r>
-              <w:t>mct__TDEA-3KEY</w:t>
-            </w:r>
-          </w:p>
-        </w:tc>
-        <w:tc>
-          <w:tcPr>
-            <w:tcW w:type="dxa" w:w="1440"/>
-          </w:tcPr>
-          <w:p>
-            <w:r>
-              <w:t>TDEA-3KEY</w:t>
-            </w:r>
-          </w:p>
-        </w:tc>
-        <w:tc>
-          <w:tcPr>
-            <w:tcW w:type="dxa" w:w="1440"/>
-          </w:tcPr>
-          <w:p>
-            <w:r>
-              <w:t>deterministic</w:t>
+              <w:t>nonce_reuse__AES-128-CTR</w:t>
+            </w:r>
+          </w:p>
+        </w:tc>
+        <w:tc>
+          <w:tcPr>
+            <w:tcW w:type="dxa" w:w="1440"/>
+          </w:tcPr>
+          <w:p>
+            <w:r>
+              <w:t>AES-128-CTR</w:t>
+            </w:r>
+          </w:p>
+        </w:tc>
+        <w:tc>
+          <w:tcPr>
+            <w:tcW w:type="dxa" w:w="1440"/>
+          </w:tcPr>
+          <w:p>
+            <w:r>
+              <w:t>negative</w:t>
             </w:r>
           </w:p>
         </w:tc>
@@ -24457,7 +24457,7 @@
           </w:tcPr>
           <w:p>
             <w:r>
-              <w:t>8b1bca6550383d17…</w:t>
+              <w:t>4b2ad92f9ab0e522…</w:t>
             </w:r>
           </w:p>
         </w:tc>
@@ -24469,27 +24469,27 @@
           </w:tcPr>
           <w:p>
             <w:r>
-              <w:t>mct__XTS-AES-256</w:t>
-            </w:r>
-          </w:p>
-        </w:tc>
-        <w:tc>
-          <w:tcPr>
-            <w:tcW w:type="dxa" w:w="1440"/>
-          </w:tcPr>
-          <w:p>
-            <w:r>
-              <w:t>XTS-AES-256</w:t>
-            </w:r>
-          </w:p>
-        </w:tc>
-        <w:tc>
-          <w:tcPr>
-            <w:tcW w:type="dxa" w:w="1440"/>
-          </w:tcPr>
-          <w:p>
-            <w:r>
-              <w:t>deterministic</w:t>
+              <w:t>nonce_reuse__AES-256-GCM</w:t>
+            </w:r>
+          </w:p>
+        </w:tc>
+        <w:tc>
+          <w:tcPr>
+            <w:tcW w:type="dxa" w:w="1440"/>
+          </w:tcPr>
+          <w:p>
+            <w:r>
+              <w:t>AES-256-GCM</w:t>
+            </w:r>
+          </w:p>
+        </w:tc>
+        <w:tc>
+          <w:tcPr>
+            <w:tcW w:type="dxa" w:w="1440"/>
+          </w:tcPr>
+          <w:p>
+            <w:r>
+              <w:t>negative</w:t>
             </w:r>
           </w:p>
         </w:tc>
@@ -24519,7 +24519,7 @@
           </w:tcPr>
           <w:p>
             <w:r>
-              <w:t>3880940fc999f3c2…</w:t>
+              <w:t>aacf7248f558d335…</w:t>
             </w:r>
           </w:p>
         </w:tc>
@@ -24531,17 +24531,17 @@
           </w:tcPr>
           <w:p>
             <w:r>
-              <w:t>nonce_reuse__AES-128-CTR</w:t>
-            </w:r>
-          </w:p>
-        </w:tc>
-        <w:tc>
-          <w:tcPr>
-            <w:tcW w:type="dxa" w:w="1440"/>
-          </w:tcPr>
-          <w:p>
-            <w:r>
-              <w:t>AES-128-CTR</w:t>
+              <w:t>nonce_reuse__CHACHA20-256</w:t>
+            </w:r>
+          </w:p>
+        </w:tc>
+        <w:tc>
+          <w:tcPr>
+            <w:tcW w:type="dxa" w:w="1440"/>
+          </w:tcPr>
+          <w:p>
+            <w:r>
+              <w:t>CHACHA20-256</w:t>
             </w:r>
           </w:p>
         </w:tc>
@@ -24581,7 +24581,7 @@
           </w:tcPr>
           <w:p>
             <w:r>
-              <w:t>4b2ad92f9ab0e522…</w:t>
+              <w:t>65c56eaa6aa53339…</w:t>
             </w:r>
           </w:p>
         </w:tc>
@@ -24593,17 +24593,17 @@
           </w:tcPr>
           <w:p>
             <w:r>
-              <w:t>nonce_reuse__AES-256-GCM</w:t>
-            </w:r>
-          </w:p>
-        </w:tc>
-        <w:tc>
-          <w:tcPr>
-            <w:tcW w:type="dxa" w:w="1440"/>
-          </w:tcPr>
-          <w:p>
-            <w:r>
-              <w:t>AES-256-GCM</w:t>
+              <w:t>nonce_reuse__CHACHA20-POLY1305</w:t>
+            </w:r>
+          </w:p>
+        </w:tc>
+        <w:tc>
+          <w:tcPr>
+            <w:tcW w:type="dxa" w:w="1440"/>
+          </w:tcPr>
+          <w:p>
+            <w:r>
+              <w:t>CHACHA20-POLY1305</w:t>
             </w:r>
           </w:p>
         </w:tc>
@@ -24643,7 +24643,7 @@
           </w:tcPr>
           <w:p>
             <w:r>
-              <w:t>aacf7248f558d335…</w:t>
+              <w:t>96061efb3a2d663b…</w:t>
             </w:r>
           </w:p>
         </w:tc>
@@ -24655,37 +24655,37 @@
           </w:tcPr>
           <w:p>
             <w:r>
-              <w:t>nonce_reuse__CHACHA20-256</w:t>
-            </w:r>
-          </w:p>
-        </w:tc>
-        <w:tc>
-          <w:tcPr>
-            <w:tcW w:type="dxa" w:w="1440"/>
-          </w:tcPr>
-          <w:p>
-            <w:r>
-              <w:t>CHACHA20-256</w:t>
-            </w:r>
-          </w:p>
-        </w:tc>
-        <w:tc>
-          <w:tcPr>
-            <w:tcW w:type="dxa" w:w="1440"/>
-          </w:tcPr>
-          <w:p>
-            <w:r>
-              <w:t>negative</w:t>
-            </w:r>
-          </w:p>
-        </w:tc>
-        <w:tc>
-          <w:tcPr>
-            <w:tcW w:type="dxa" w:w="1440"/>
-          </w:tcPr>
-          <w:p>
-            <w:r>
-              <w:t>KRITERIA</w:t>
+              <w:t>performance__AES-128-CTR</w:t>
+            </w:r>
+          </w:p>
+        </w:tc>
+        <w:tc>
+          <w:tcPr>
+            <w:tcW w:type="dxa" w:w="1440"/>
+          </w:tcPr>
+          <w:p>
+            <w:r>
+              <w:t>AES-128-CTR</w:t>
+            </w:r>
+          </w:p>
+        </w:tc>
+        <w:tc>
+          <w:tcPr>
+            <w:tcW w:type="dxa" w:w="1440"/>
+          </w:tcPr>
+          <w:p>
+            <w:r>
+              <w:t>implementation</w:t>
+            </w:r>
+          </w:p>
+        </w:tc>
+        <w:tc>
+          <w:tcPr>
+            <w:tcW w:type="dxa" w:w="1440"/>
+          </w:tcPr>
+          <w:p>
+            <w:r>
+              <w:t>PERLU_VERIFIKASI</w:t>
             </w:r>
           </w:p>
         </w:tc>
@@ -24705,7 +24705,7 @@
           </w:tcPr>
           <w:p>
             <w:r>
-              <w:t>65c56eaa6aa53339…</w:t>
+              <w:t>1fad30a63de48f03…</w:t>
             </w:r>
           </w:p>
         </w:tc>
@@ -24717,37 +24717,37 @@
           </w:tcPr>
           <w:p>
             <w:r>
-              <w:t>nonce_reuse__CHACHA20-POLY1305</w:t>
-            </w:r>
-          </w:p>
-        </w:tc>
-        <w:tc>
-          <w:tcPr>
-            <w:tcW w:type="dxa" w:w="1440"/>
-          </w:tcPr>
-          <w:p>
-            <w:r>
-              <w:t>CHACHA20-POLY1305</w:t>
-            </w:r>
-          </w:p>
-        </w:tc>
-        <w:tc>
-          <w:tcPr>
-            <w:tcW w:type="dxa" w:w="1440"/>
-          </w:tcPr>
-          <w:p>
-            <w:r>
-              <w:t>negative</w:t>
-            </w:r>
-          </w:p>
-        </w:tc>
-        <w:tc>
-          <w:tcPr>
-            <w:tcW w:type="dxa" w:w="1440"/>
-          </w:tcPr>
-          <w:p>
-            <w:r>
-              <w:t>KRITERIA</w:t>
+              <w:t>performance__AES-256-GCM</w:t>
+            </w:r>
+          </w:p>
+        </w:tc>
+        <w:tc>
+          <w:tcPr>
+            <w:tcW w:type="dxa" w:w="1440"/>
+          </w:tcPr>
+          <w:p>
+            <w:r>
+              <w:t>AES-256-GCM</w:t>
+            </w:r>
+          </w:p>
+        </w:tc>
+        <w:tc>
+          <w:tcPr>
+            <w:tcW w:type="dxa" w:w="1440"/>
+          </w:tcPr>
+          <w:p>
+            <w:r>
+              <w:t>implementation</w:t>
+            </w:r>
+          </w:p>
+        </w:tc>
+        <w:tc>
+          <w:tcPr>
+            <w:tcW w:type="dxa" w:w="1440"/>
+          </w:tcPr>
+          <w:p>
+            <w:r>
+              <w:t>PERLU_VERIFIKASI</w:t>
             </w:r>
           </w:p>
         </w:tc>
@@ -24767,7 +24767,7 @@
           </w:tcPr>
           <w:p>
             <w:r>
-              <w:t>96061efb3a2d663b…</w:t>
+              <w:t>599fba162a789cb4…</w:t>
             </w:r>
           </w:p>
         </w:tc>
@@ -24779,17 +24779,17 @@
           </w:tcPr>
           <w:p>
             <w:r>
-              <w:t>performance__AES-128-CTR</w:t>
-            </w:r>
-          </w:p>
-        </w:tc>
-        <w:tc>
-          <w:tcPr>
-            <w:tcW w:type="dxa" w:w="1440"/>
-          </w:tcPr>
-          <w:p>
-            <w:r>
-              <w:t>AES-128-CTR</w:t>
+              <w:t>performance__AES-256-KW</w:t>
+            </w:r>
+          </w:p>
+        </w:tc>
+        <w:tc>
+          <w:tcPr>
+            <w:tcW w:type="dxa" w:w="1440"/>
+          </w:tcPr>
+          <w:p>
+            <w:r>
+              <w:t>AES-256-KW</w:t>
             </w:r>
           </w:p>
         </w:tc>
@@ -24829,7 +24829,7 @@
           </w:tcPr>
           <w:p>
             <w:r>
-              <w:t>1fad30a63de48f03…</w:t>
+              <w:t>136df3fab6081419…</w:t>
             </w:r>
           </w:p>
         </w:tc>
@@ -24841,17 +24841,17 @@
           </w:tcPr>
           <w:p>
             <w:r>
-              <w:t>performance__AES-256-GCM</w:t>
-            </w:r>
-          </w:p>
-        </w:tc>
-        <w:tc>
-          <w:tcPr>
-            <w:tcW w:type="dxa" w:w="1440"/>
-          </w:tcPr>
-          <w:p>
-            <w:r>
-              <w:t>AES-256-GCM</w:t>
+              <w:t>performance__ASCON-AEAD128</w:t>
+            </w:r>
+          </w:p>
+        </w:tc>
+        <w:tc>
+          <w:tcPr>
+            <w:tcW w:type="dxa" w:w="1440"/>
+          </w:tcPr>
+          <w:p>
+            <w:r>
+              <w:t>ASCON-AEAD128</w:t>
             </w:r>
           </w:p>
         </w:tc>
@@ -24891,7 +24891,7 @@
           </w:tcPr>
           <w:p>
             <w:r>
-              <w:t>599fba162a789cb4…</w:t>
+              <w:t>2cfe2cab23a985b5…</w:t>
             </w:r>
           </w:p>
         </w:tc>
@@ -24903,17 +24903,17 @@
           </w:tcPr>
           <w:p>
             <w:r>
-              <w:t>performance__AES-256-KW</w:t>
-            </w:r>
-          </w:p>
-        </w:tc>
-        <w:tc>
-          <w:tcPr>
-            <w:tcW w:type="dxa" w:w="1440"/>
-          </w:tcPr>
-          <w:p>
-            <w:r>
-              <w:t>AES-256-KW</w:t>
+              <w:t>performance__BLAKE2B-512</w:t>
+            </w:r>
+          </w:p>
+        </w:tc>
+        <w:tc>
+          <w:tcPr>
+            <w:tcW w:type="dxa" w:w="1440"/>
+          </w:tcPr>
+          <w:p>
+            <w:r>
+              <w:t>BLAKE2B-512</w:t>
             </w:r>
           </w:p>
         </w:tc>
@@ -24953,7 +24953,7 @@
           </w:tcPr>
           <w:p>
             <w:r>
-              <w:t>136df3fab6081419…</w:t>
+              <w:t>45ffd0137d6be284…</w:t>
             </w:r>
           </w:p>
         </w:tc>
@@ -24965,17 +24965,17 @@
           </w:tcPr>
           <w:p>
             <w:r>
-              <w:t>performance__ASCON-AEAD128</w:t>
-            </w:r>
-          </w:p>
-        </w:tc>
-        <w:tc>
-          <w:tcPr>
-            <w:tcW w:type="dxa" w:w="1440"/>
-          </w:tcPr>
-          <w:p>
-            <w:r>
-              <w:t>ASCON-AEAD128</w:t>
+              <w:t>performance__CHACHA20-256</w:t>
+            </w:r>
+          </w:p>
+        </w:tc>
+        <w:tc>
+          <w:tcPr>
+            <w:tcW w:type="dxa" w:w="1440"/>
+          </w:tcPr>
+          <w:p>
+            <w:r>
+              <w:t>CHACHA20-256</w:t>
             </w:r>
           </w:p>
         </w:tc>
@@ -25015,7 +25015,7 @@
           </w:tcPr>
           <w:p>
             <w:r>
-              <w:t>2cfe2cab23a985b5…</w:t>
+              <w:t>1d0364df654b1925…</w:t>
             </w:r>
           </w:p>
         </w:tc>
@@ -25027,17 +25027,17 @@
           </w:tcPr>
           <w:p>
             <w:r>
-              <w:t>performance__BLAKE2B-512</w:t>
-            </w:r>
-          </w:p>
-        </w:tc>
-        <w:tc>
-          <w:tcPr>
-            <w:tcW w:type="dxa" w:w="1440"/>
-          </w:tcPr>
-          <w:p>
-            <w:r>
-              <w:t>BLAKE2B-512</w:t>
+              <w:t>performance__CHACHA20-POLY1305</w:t>
+            </w:r>
+          </w:p>
+        </w:tc>
+        <w:tc>
+          <w:tcPr>
+            <w:tcW w:type="dxa" w:w="1440"/>
+          </w:tcPr>
+          <w:p>
+            <w:r>
+              <w:t>CHACHA20-POLY1305</w:t>
             </w:r>
           </w:p>
         </w:tc>
@@ -25077,7 +25077,7 @@
           </w:tcPr>
           <w:p>
             <w:r>
-              <w:t>45ffd0137d6be284…</w:t>
+              <w:t>880c61a2bbf10ad7…</w:t>
             </w:r>
           </w:p>
         </w:tc>
@@ -25089,17 +25089,17 @@
           </w:tcPr>
           <w:p>
             <w:r>
-              <w:t>performance__CHACHA20-256</w:t>
-            </w:r>
-          </w:p>
-        </w:tc>
-        <w:tc>
-          <w:tcPr>
-            <w:tcW w:type="dxa" w:w="1440"/>
-          </w:tcPr>
-          <w:p>
-            <w:r>
-              <w:t>CHACHA20-256</w:t>
+              <w:t>performance__CMAC-AES-128</w:t>
+            </w:r>
+          </w:p>
+        </w:tc>
+        <w:tc>
+          <w:tcPr>
+            <w:tcW w:type="dxa" w:w="1440"/>
+          </w:tcPr>
+          <w:p>
+            <w:r>
+              <w:t>CMAC-AES-128</w:t>
             </w:r>
           </w:p>
         </w:tc>
@@ -25139,7 +25139,7 @@
           </w:tcPr>
           <w:p>
             <w:r>
-              <w:t>1d0364df654b1925…</w:t>
+              <w:t>ef4a172fb7b869ab…</w:t>
             </w:r>
           </w:p>
         </w:tc>
@@ -25151,17 +25151,17 @@
           </w:tcPr>
           <w:p>
             <w:r>
-              <w:t>performance__CHACHA20-POLY1305</w:t>
-            </w:r>
-          </w:p>
-        </w:tc>
-        <w:tc>
-          <w:tcPr>
-            <w:tcW w:type="dxa" w:w="1440"/>
-          </w:tcPr>
-          <w:p>
-            <w:r>
-              <w:t>CHACHA20-POLY1305</w:t>
+              <w:t>performance__ECDH-P384</w:t>
+            </w:r>
+          </w:p>
+        </w:tc>
+        <w:tc>
+          <w:tcPr>
+            <w:tcW w:type="dxa" w:w="1440"/>
+          </w:tcPr>
+          <w:p>
+            <w:r>
+              <w:t>ECDH-P384</w:t>
             </w:r>
           </w:p>
         </w:tc>
@@ -25201,7 +25201,7 @@
           </w:tcPr>
           <w:p>
             <w:r>
-              <w:t>880c61a2bbf10ad7…</w:t>
+              <w:t>4fbf96720fd01858…</w:t>
             </w:r>
           </w:p>
         </w:tc>
@@ -25213,17 +25213,17 @@
           </w:tcPr>
           <w:p>
             <w:r>
-              <w:t>performance__CMAC-AES-128</w:t>
-            </w:r>
-          </w:p>
-        </w:tc>
-        <w:tc>
-          <w:tcPr>
-            <w:tcW w:type="dxa" w:w="1440"/>
-          </w:tcPr>
-          <w:p>
-            <w:r>
-              <w:t>CMAC-AES-128</w:t>
+              <w:t>performance__FFDHE3072</w:t>
+            </w:r>
+          </w:p>
+        </w:tc>
+        <w:tc>
+          <w:tcPr>
+            <w:tcW w:type="dxa" w:w="1440"/>
+          </w:tcPr>
+          <w:p>
+            <w:r>
+              <w:t>FFDHE3072</w:t>
             </w:r>
           </w:p>
         </w:tc>
@@ -25263,7 +25263,7 @@
           </w:tcPr>
           <w:p>
             <w:r>
-              <w:t>ef4a172fb7b869ab…</w:t>
+              <w:t>ac49bdb3abe597b2…</w:t>
             </w:r>
           </w:p>
         </w:tc>
@@ -25275,17 +25275,17 @@
           </w:tcPr>
           <w:p>
             <w:r>
-              <w:t>performance__ECDH-P384</w:t>
-            </w:r>
-          </w:p>
-        </w:tc>
-        <w:tc>
-          <w:tcPr>
-            <w:tcW w:type="dxa" w:w="1440"/>
-          </w:tcPr>
-          <w:p>
-            <w:r>
-              <w:t>ECDH-P384</w:t>
+              <w:t>performance__HMAC-SHA-256-K128</w:t>
+            </w:r>
+          </w:p>
+        </w:tc>
+        <w:tc>
+          <w:tcPr>
+            <w:tcW w:type="dxa" w:w="1440"/>
+          </w:tcPr>
+          <w:p>
+            <w:r>
+              <w:t>HMAC-SHA-256-K128</w:t>
             </w:r>
           </w:p>
         </w:tc>
@@ -25325,7 +25325,7 @@
           </w:tcPr>
           <w:p>
             <w:r>
-              <w:t>4fbf96720fd01858…</w:t>
+              <w:t>f04dc9016eedf6c7…</w:t>
             </w:r>
           </w:p>
         </w:tc>
@@ -25337,17 +25337,17 @@
           </w:tcPr>
           <w:p>
             <w:r>
-              <w:t>performance__FFDHE3072</w:t>
-            </w:r>
-          </w:p>
-        </w:tc>
-        <w:tc>
-          <w:tcPr>
-            <w:tcW w:type="dxa" w:w="1440"/>
-          </w:tcPr>
-          <w:p>
-            <w:r>
-              <w:t>FFDHE3072</w:t>
+              <w:t>performance__HMAC-SHA-256-K256</w:t>
+            </w:r>
+          </w:p>
+        </w:tc>
+        <w:tc>
+          <w:tcPr>
+            <w:tcW w:type="dxa" w:w="1440"/>
+          </w:tcPr>
+          <w:p>
+            <w:r>
+              <w:t>HMAC-SHA-256-K256</w:t>
             </w:r>
           </w:p>
         </w:tc>
@@ -25387,7 +25387,7 @@
           </w:tcPr>
           <w:p>
             <w:r>
-              <w:t>ac49bdb3abe597b2…</w:t>
+              <w:t>709a6dfa6b2b25d8…</w:t>
             </w:r>
           </w:p>
         </w:tc>
@@ -25399,17 +25399,17 @@
           </w:tcPr>
           <w:p>
             <w:r>
-              <w:t>performance__HMAC-SHA-256-K128</w:t>
-            </w:r>
-          </w:p>
-        </w:tc>
-        <w:tc>
-          <w:tcPr>
-            <w:tcW w:type="dxa" w:w="1440"/>
-          </w:tcPr>
-          <w:p>
-            <w:r>
-              <w:t>HMAC-SHA-256-K128</w:t>
+              <w:t>performance__ML-KEM-768</w:t>
+            </w:r>
+          </w:p>
+        </w:tc>
+        <w:tc>
+          <w:tcPr>
+            <w:tcW w:type="dxa" w:w="1440"/>
+          </w:tcPr>
+          <w:p>
+            <w:r>
+              <w:t>ML-KEM-768</w:t>
             </w:r>
           </w:p>
         </w:tc>
@@ -25449,7 +25449,7 @@
           </w:tcPr>
           <w:p>
             <w:r>
-              <w:t>f04dc9016eedf6c7…</w:t>
+              <w:t>b8a90ca8ab88c2d7…</w:t>
             </w:r>
           </w:p>
         </w:tc>
@@ -25461,17 +25461,17 @@
           </w:tcPr>
           <w:p>
             <w:r>
-              <w:t>performance__HMAC-SHA-256-K256</w:t>
-            </w:r>
-          </w:p>
-        </w:tc>
-        <w:tc>
-          <w:tcPr>
-            <w:tcW w:type="dxa" w:w="1440"/>
-          </w:tcPr>
-          <w:p>
-            <w:r>
-              <w:t>HMAC-SHA-256-K256</w:t>
+              <w:t>performance__PRESENT-80</w:t>
+            </w:r>
+          </w:p>
+        </w:tc>
+        <w:tc>
+          <w:tcPr>
+            <w:tcW w:type="dxa" w:w="1440"/>
+          </w:tcPr>
+          <w:p>
+            <w:r>
+              <w:t>PRESENT-80</w:t>
             </w:r>
           </w:p>
         </w:tc>
@@ -25511,7 +25511,7 @@
           </w:tcPr>
           <w:p>
             <w:r>
-              <w:t>709a6dfa6b2b25d8…</w:t>
+              <w:t>73dc85c2a31d3426…</w:t>
             </w:r>
           </w:p>
         </w:tc>
@@ -25523,17 +25523,17 @@
           </w:tcPr>
           <w:p>
             <w:r>
-              <w:t>performance__ML-KEM-768</w:t>
-            </w:r>
-          </w:p>
-        </w:tc>
-        <w:tc>
-          <w:tcPr>
-            <w:tcW w:type="dxa" w:w="1440"/>
-          </w:tcPr>
-          <w:p>
-            <w:r>
-              <w:t>ML-KEM-768</w:t>
+              <w:t>performance__RSA-OAEP-2048</w:t>
+            </w:r>
+          </w:p>
+        </w:tc>
+        <w:tc>
+          <w:tcPr>
+            <w:tcW w:type="dxa" w:w="1440"/>
+          </w:tcPr>
+          <w:p>
+            <w:r>
+              <w:t>RSA-OAEP-2048</w:t>
             </w:r>
           </w:p>
         </w:tc>
@@ -25573,7 +25573,7 @@
           </w:tcPr>
           <w:p>
             <w:r>
-              <w:t>b8a90ca8ab88c2d7…</w:t>
+              <w:t>9c214e37545321bd…</w:t>
             </w:r>
           </w:p>
         </w:tc>
@@ -25585,17 +25585,17 @@
           </w:tcPr>
           <w:p>
             <w:r>
-              <w:t>performance__PRESENT-80</w:t>
-            </w:r>
-          </w:p>
-        </w:tc>
-        <w:tc>
-          <w:tcPr>
-            <w:tcW w:type="dxa" w:w="1440"/>
-          </w:tcPr>
-          <w:p>
-            <w:r>
-              <w:t>PRESENT-80</w:t>
+              <w:t>performance__RSA-OAEP-3072</w:t>
+            </w:r>
+          </w:p>
+        </w:tc>
+        <w:tc>
+          <w:tcPr>
+            <w:tcW w:type="dxa" w:w="1440"/>
+          </w:tcPr>
+          <w:p>
+            <w:r>
+              <w:t>RSA-OAEP-3072</w:t>
             </w:r>
           </w:p>
         </w:tc>
@@ -25635,7 +25635,7 @@
           </w:tcPr>
           <w:p>
             <w:r>
-              <w:t>73dc85c2a31d3426…</w:t>
+              <w:t>8eccd6bffb37e0ee…</w:t>
             </w:r>
           </w:p>
         </w:tc>
@@ -25647,17 +25647,17 @@
           </w:tcPr>
           <w:p>
             <w:r>
-              <w:t>performance__RSA-OAEP-2048</w:t>
-            </w:r>
-          </w:p>
-        </w:tc>
-        <w:tc>
-          <w:tcPr>
-            <w:tcW w:type="dxa" w:w="1440"/>
-          </w:tcPr>
-          <w:p>
-            <w:r>
-              <w:t>RSA-OAEP-2048</w:t>
+              <w:t>performance__RSAES-PKCS1-V1_5-1024</w:t>
+            </w:r>
+          </w:p>
+        </w:tc>
+        <w:tc>
+          <w:tcPr>
+            <w:tcW w:type="dxa" w:w="1440"/>
+          </w:tcPr>
+          <w:p>
+            <w:r>
+              <w:t>RSAES-PKCS1-V1_5-1024</w:t>
             </w:r>
           </w:p>
         </w:tc>
@@ -25697,7 +25697,7 @@
           </w:tcPr>
           <w:p>
             <w:r>
-              <w:t>9c214e37545321bd…</w:t>
+              <w:t>74203a4cea6e1786…</w:t>
             </w:r>
           </w:p>
         </w:tc>
@@ -25709,17 +25709,17 @@
           </w:tcPr>
           <w:p>
             <w:r>
-              <w:t>performance__RSA-OAEP-3072</w:t>
-            </w:r>
-          </w:p>
-        </w:tc>
-        <w:tc>
-          <w:tcPr>
-            <w:tcW w:type="dxa" w:w="1440"/>
-          </w:tcPr>
-          <w:p>
-            <w:r>
-              <w:t>RSA-OAEP-3072</w:t>
+              <w:t>performance__SHA-1</w:t>
+            </w:r>
+          </w:p>
+        </w:tc>
+        <w:tc>
+          <w:tcPr>
+            <w:tcW w:type="dxa" w:w="1440"/>
+          </w:tcPr>
+          <w:p>
+            <w:r>
+              <w:t>SHA-1</w:t>
             </w:r>
           </w:p>
         </w:tc>
@@ -25759,7 +25759,7 @@
           </w:tcPr>
           <w:p>
             <w:r>
-              <w:t>8eccd6bffb37e0ee…</w:t>
+              <w:t>9169b229a8dac86c…</w:t>
             </w:r>
           </w:p>
         </w:tc>
@@ -25771,17 +25771,17 @@
           </w:tcPr>
           <w:p>
             <w:r>
-              <w:t>performance__RSAES-PKCS1-V1_5-1024</w:t>
-            </w:r>
-          </w:p>
-        </w:tc>
-        <w:tc>
-          <w:tcPr>
-            <w:tcW w:type="dxa" w:w="1440"/>
-          </w:tcPr>
-          <w:p>
-            <w:r>
-              <w:t>RSAES-PKCS1-V1_5-1024</w:t>
+              <w:t>performance__SHA-256</w:t>
+            </w:r>
+          </w:p>
+        </w:tc>
+        <w:tc>
+          <w:tcPr>
+            <w:tcW w:type="dxa" w:w="1440"/>
+          </w:tcPr>
+          <w:p>
+            <w:r>
+              <w:t>SHA-256</w:t>
             </w:r>
           </w:p>
         </w:tc>
@@ -25821,7 +25821,7 @@
           </w:tcPr>
           <w:p>
             <w:r>
-              <w:t>74203a4cea6e1786…</w:t>
+              <w:t>14f4736f3ae751b1…</w:t>
             </w:r>
           </w:p>
         </w:tc>
@@ -25833,17 +25833,17 @@
           </w:tcPr>
           <w:p>
             <w:r>
-              <w:t>performance__SHA-1</w:t>
-            </w:r>
-          </w:p>
-        </w:tc>
-        <w:tc>
-          <w:tcPr>
-            <w:tcW w:type="dxa" w:w="1440"/>
-          </w:tcPr>
-          <w:p>
-            <w:r>
-              <w:t>SHA-1</w:t>
+              <w:t>performance__SHA-384</w:t>
+            </w:r>
+          </w:p>
+        </w:tc>
+        <w:tc>
+          <w:tcPr>
+            <w:tcW w:type="dxa" w:w="1440"/>
+          </w:tcPr>
+          <w:p>
+            <w:r>
+              <w:t>SHA-384</w:t>
             </w:r>
           </w:p>
         </w:tc>
@@ -25883,7 +25883,7 @@
           </w:tcPr>
           <w:p>
             <w:r>
-              <w:t>9169b229a8dac86c…</w:t>
+              <w:t>611388767cc80827…</w:t>
             </w:r>
           </w:p>
         </w:tc>
@@ -25895,17 +25895,17 @@
           </w:tcPr>
           <w:p>
             <w:r>
-              <w:t>performance__SHA-256</w:t>
-            </w:r>
-          </w:p>
-        </w:tc>
-        <w:tc>
-          <w:tcPr>
-            <w:tcW w:type="dxa" w:w="1440"/>
-          </w:tcPr>
-          <w:p>
-            <w:r>
-              <w:t>SHA-256</w:t>
+              <w:t>performance__SHA-512_256</w:t>
+            </w:r>
+          </w:p>
+        </w:tc>
+        <w:tc>
+          <w:tcPr>
+            <w:tcW w:type="dxa" w:w="1440"/>
+          </w:tcPr>
+          <w:p>
+            <w:r>
+              <w:t>SHA-512/256</w:t>
             </w:r>
           </w:p>
         </w:tc>
@@ -25945,7 +25945,7 @@
           </w:tcPr>
           <w:p>
             <w:r>
-              <w:t>14f4736f3ae751b1…</w:t>
+              <w:t>9d3b35d7e6f19770…</w:t>
             </w:r>
           </w:p>
         </w:tc>
@@ -25957,17 +25957,17 @@
           </w:tcPr>
           <w:p>
             <w:r>
-              <w:t>performance__SHA-384</w:t>
-            </w:r>
-          </w:p>
-        </w:tc>
-        <w:tc>
-          <w:tcPr>
-            <w:tcW w:type="dxa" w:w="1440"/>
-          </w:tcPr>
-          <w:p>
-            <w:r>
-              <w:t>SHA-384</w:t>
+              <w:t>performance__SHA3-256</w:t>
+            </w:r>
+          </w:p>
+        </w:tc>
+        <w:tc>
+          <w:tcPr>
+            <w:tcW w:type="dxa" w:w="1440"/>
+          </w:tcPr>
+          <w:p>
+            <w:r>
+              <w:t>SHA3-256</w:t>
             </w:r>
           </w:p>
         </w:tc>
@@ -26007,7 +26007,7 @@
           </w:tcPr>
           <w:p>
             <w:r>
-              <w:t>611388767cc80827…</w:t>
+              <w:t>293488ebc798f7fa…</w:t>
             </w:r>
           </w:p>
         </w:tc>

</xml_diff>